<commit_message>
3AS probability plans: add lists, arrangements and permutations sessions for maths/technical maths streams; renumber later units
Co-Authored-By: Claude Opus 5.5 <noreply@anthropic.com>
Claude-Session: https://claude.ai/code/session_015WVgZKTbSWpZTjn6aZsqC9
</commit_message>
<xml_diff>
--- a/documents/3as/modhakirat/modhakira_wahda10_3as.docx
+++ b/documents/3as/modhakirat/modhakira_wahda10_3as.docx
@@ -347,7 +347,7 @@
                 <w:color w:val="FFFFFF"/>
                 <w:rtl/>
               </w:rPr>
-              <w:t xml:space="preserve">مذكرة رقم 77</w:t>
+              <w:t xml:space="preserve">مذكرة رقم 79</w:t>
             </w:r>
           </w:p>
         </w:tc>
@@ -2598,7 +2598,7 @@
                 <w:color w:val="FFFFFF"/>
                 <w:rtl/>
               </w:rPr>
-              <w:t xml:space="preserve">مذكرة رقم 78</w:t>
+              <w:t xml:space="preserve">مذكرة رقم 80</w:t>
             </w:r>
           </w:p>
         </w:tc>
@@ -4853,7 +4853,7 @@
                 <w:color w:val="FFFFFF"/>
                 <w:rtl/>
               </w:rPr>
-              <w:t xml:space="preserve">مذكرة رقم 79</w:t>
+              <w:t xml:space="preserve">مذكرة رقم 81</w:t>
             </w:r>
           </w:p>
         </w:tc>
@@ -7073,7 +7073,7 @@
                 <w:color w:val="FFFFFF"/>
                 <w:rtl/>
               </w:rPr>
-              <w:t xml:space="preserve">مذكرة رقم 80</w:t>
+              <w:t xml:space="preserve">مذكرة رقم 82</w:t>
             </w:r>
           </w:p>
         </w:tc>
@@ -9399,7 +9399,7 @@
                 <w:color w:val="FFFFFF"/>
                 <w:rtl/>
               </w:rPr>
-              <w:t xml:space="preserve">مذكرة رقم 81</w:t>
+              <w:t xml:space="preserve">مذكرة رقم 83</w:t>
             </w:r>
           </w:p>
         </w:tc>
@@ -11658,7 +11658,7 @@
                 <w:color w:val="FFFFFF"/>
                 <w:rtl/>
               </w:rPr>
-              <w:t xml:space="preserve">مذكرة رقم 82</w:t>
+              <w:t xml:space="preserve">مذكرة رقم 84</w:t>
             </w:r>
           </w:p>
         </w:tc>
@@ -13591,7 +13591,7 @@
                 <w:color w:val="FFFFFF"/>
                 <w:rtl/>
               </w:rPr>
-              <w:t xml:space="preserve">مذكرة رقم 83</w:t>
+              <w:t xml:space="preserve">مذكرة رقم 85</w:t>
             </w:r>
           </w:p>
         </w:tc>
@@ -15596,7 +15596,7 @@
                 <w:color w:val="FFFFFF"/>
                 <w:rtl/>
               </w:rPr>
-              <w:t xml:space="preserve">مذكرة رقم 84</w:t>
+              <w:t xml:space="preserve">مذكرة رقم 86</w:t>
             </w:r>
           </w:p>
         </w:tc>
@@ -17294,7 +17294,7 @@
                 <w:color w:val="FFFFFF"/>
                 <w:rtl/>
               </w:rPr>
-              <w:t xml:space="preserve">مذكرة رقم 85</w:t>
+              <w:t xml:space="preserve">مذكرة رقم 87</w:t>
             </w:r>
           </w:p>
         </w:tc>

</xml_diff>

<commit_message>
3AS space plans: add sphere, cylinder and cone session for maths/technical maths streams
Co-Authored-By: Claude Opus 5.5 <noreply@anthropic.com>
Claude-Session: https://claude.ai/code/session_015WVgZKTbSWpZTjn6aZsqC9
</commit_message>
<xml_diff>
--- a/documents/3as/modhakirat/modhakira_wahda10_3as.docx
+++ b/documents/3as/modhakirat/modhakira_wahda10_3as.docx
@@ -54,7 +54,7 @@
                 <w:szCs w:val="30"/>
                 <w:rtl/>
               </w:rPr>
-              <w:t xml:space="preserve">السنة الثالثة ثانوي – علوم تجريبية</w:t>
+              <w:t xml:space="preserve">السنة الثالثة ثانوي – علوم تجريبية ، رياضيات ، تقني رياضي</w:t>
             </w:r>
           </w:p>
           <w:p>
@@ -70,7 +70,7 @@
                 <w:szCs w:val="30"/>
                 <w:rtl/>
               </w:rPr>
-              <w:t xml:space="preserve">9 مذكرات (18 ساعة) – السنة الدراسية 2026-2027</w:t>
+              <w:t xml:space="preserve">10 مذكرات (20 ساعة) ، منها 1 لشعبتي رياضيات وتقني رياضي – 2026-2027</w:t>
             </w:r>
           </w:p>
         </w:tc>
@@ -239,7 +239,27 @@
               <w:rPr>
                 <w:rtl/>
               </w:rPr>
-              <w:t xml:space="preserve">الأوضاع النسبية لمستقيم ومستو ، ولمستويين.</w:t>
+              <w:t xml:space="preserve">سطح الكرة ، الأسطوانة ، المخروط</w:t>
+            </w:r>
+            <w:r>
+              <w:rPr>
+                <w:rtl/>
+              </w:rPr>
+              <w:t xml:space="preserve"> </w:t>
+            </w:r>
+            <w:r>
+              <w:rPr>
+                <w:b/>
+                <w:bCs/>
+                <w:rtl/>
+              </w:rPr>
+              <w:t xml:space="preserve">(رياضيات وتقني رياضي)</w:t>
+            </w:r>
+            <w:r>
+              <w:rPr>
+                <w:rtl/>
+              </w:rPr>
+              <w:t xml:space="preserve">.</w:t>
             </w:r>
           </w:p>
           <w:p>
@@ -254,7 +274,7 @@
               <w:rPr>
                 <w:rtl/>
               </w:rPr>
-              <w:t xml:space="preserve">تقاطع ثلاثة مستويات ، الانتقال بين التمثيلات.</w:t>
+              <w:t xml:space="preserve">الأوضاع النسبية لمستقيم ومستو ، ولمستويين.</w:t>
             </w:r>
           </w:p>
           <w:p>
@@ -269,6 +289,21 @@
               <w:rPr>
                 <w:rtl/>
               </w:rPr>
+              <w:t xml:space="preserve">تقاطع ثلاثة مستويات ، الانتقال بين التمثيلات.</w:t>
+            </w:r>
+          </w:p>
+          <w:p>
+            <w:pPr>
+              <w:numPr>
+                <w:ilvl w:val="0"/>
+                <w:numId w:val="1001"/>
+              </w:numPr>
+              <w:bidi/>
+            </w:pPr>
+            <w:r>
+              <w:rPr>
+                <w:rtl/>
+              </w:rPr>
               <w:t xml:space="preserve">حل مسائل في الهندسة الفضائية.</w:t>
             </w:r>
           </w:p>
@@ -280,7 +315,7 @@
               <w:rPr>
                 <w:rtl/>
               </w:rPr>
-              <w:t xml:space="preserve">مراجع: الكتاب المدرسي للسنة الثالثة ثانوي ، الجزء الثاني (باب الهندسة في الفضاء). شعبة العلوم التجريبية: المسافة بفيثاغورس فقط ، دون معادلات الكرة والأسطوانة والمخروط (تضاف لشعبتي رياضيات وتقني رياضي).</w:t>
+              <w:t xml:space="preserve">مراجع: الكتاب المدرسي للسنة الثالثة ثانوي ، الجزء الثاني (باب الهندسة في الفضاء). المذكرة 85 خاصة بشعبتي رياضيات وتقني رياضي ؛ شعبة العلوم التجريبية: المسافة بفيثاغورس فقط ، دون معادلات الكرة والأسطوانة والمخروط.</w:t>
             </w:r>
           </w:p>
         </w:tc>
@@ -13648,6 +13683,3216 @@
                     <w:rPr>
                       <w:rtl/>
                     </w:rPr>
+                    <w:t xml:space="preserve">3 ر / 3 ت ر</w:t>
+                  </w:r>
+                </w:p>
+              </w:tc>
+              <w:tc>
+                <w:tcPr/>
+                <w:p>
+                  <w:pPr>
+                    <w:pStyle w:val="Compact"/>
+                    <w:bidi/>
+                    <w:jc w:val="left"/>
+                  </w:pPr>
+                  <w:r>
+                    <w:rPr>
+                      <w:b/>
+                      <w:bCs/>
+                      <w:rtl/>
+                    </w:rPr>
+                    <w:t xml:space="preserve">الثانوية:</w:t>
+                  </w:r>
+                  <w:r>
+                    <w:rPr>
+                      <w:rtl/>
+                    </w:rPr>
+                    <w:t xml:space="preserve"> </w:t>
+                  </w:r>
+                  <w:r>
+                    <w:rPr>
+                      <w:rtl/>
+                    </w:rPr>
+                    <w:t xml:space="preserve">..........</w:t>
+                  </w:r>
+                </w:p>
+              </w:tc>
+            </w:tr>
+            <w:tr>
+              <w:tc>
+                <w:tcPr/>
+                <w:p>
+                  <w:pPr>
+                    <w:pStyle w:val="Compact"/>
+                    <w:bidi/>
+                    <w:jc w:val="left"/>
+                  </w:pPr>
+                  <w:r>
+                    <w:rPr>
+                      <w:b/>
+                      <w:bCs/>
+                      <w:rtl/>
+                    </w:rPr>
+                    <w:t xml:space="preserve">المادة:</w:t>
+                  </w:r>
+                  <w:r>
+                    <w:rPr>
+                      <w:rtl/>
+                    </w:rPr>
+                    <w:t xml:space="preserve"> </w:t>
+                  </w:r>
+                  <w:r>
+                    <w:rPr>
+                      <w:rtl/>
+                    </w:rPr>
+                    <w:t xml:space="preserve">رياضيات</w:t>
+                  </w:r>
+                </w:p>
+              </w:tc>
+              <w:tc>
+                <w:tcPr/>
+                <w:p>
+                  <w:pPr>
+                    <w:pStyle w:val="Compact"/>
+                    <w:bidi/>
+                    <w:jc w:val="left"/>
+                  </w:pPr>
+                  <w:r>
+                    <w:rPr>
+                      <w:b/>
+                      <w:bCs/>
+                      <w:rtl/>
+                    </w:rPr>
+                    <w:t xml:space="preserve">ميدان التعلم:</w:t>
+                  </w:r>
+                  <w:r>
+                    <w:rPr>
+                      <w:rtl/>
+                    </w:rPr>
+                    <w:t xml:space="preserve"> </w:t>
+                  </w:r>
+                  <w:r>
+                    <w:rPr>
+                      <w:rtl/>
+                    </w:rPr>
+                    <w:t xml:space="preserve">هندسة</w:t>
+                  </w:r>
+                </w:p>
+              </w:tc>
+            </w:tr>
+            <w:tr>
+              <w:tc>
+                <w:tcPr/>
+                <w:p>
+                  <w:pPr>
+                    <w:pStyle w:val="Compact"/>
+                    <w:bidi/>
+                    <w:jc w:val="left"/>
+                  </w:pPr>
+                  <w:r>
+                    <w:rPr>
+                      <w:b/>
+                      <w:bCs/>
+                      <w:rtl/>
+                    </w:rPr>
+                    <w:t xml:space="preserve">المدة:</w:t>
+                  </w:r>
+                  <w:r>
+                    <w:rPr>
+                      <w:rtl/>
+                    </w:rPr>
+                    <w:t xml:space="preserve"> </w:t>
+                  </w:r>
+                  <w:r>
+                    <w:rPr>
+                      <w:rtl/>
+                    </w:rPr>
+                    <w:t xml:space="preserve">02 سا</w:t>
+                  </w:r>
+                </w:p>
+              </w:tc>
+              <w:tc>
+                <w:tcPr/>
+                <w:p>
+                  <w:pPr>
+                    <w:pStyle w:val="Compact"/>
+                    <w:bidi/>
+                    <w:jc w:val="left"/>
+                  </w:pPr>
+                  <w:r>
+                    <w:rPr>
+                      <w:b/>
+                      <w:bCs/>
+                      <w:rtl/>
+                    </w:rPr>
+                    <w:t xml:space="preserve">الوحدة التعلمية:</w:t>
+                  </w:r>
+                  <w:r>
+                    <w:rPr>
+                      <w:rtl/>
+                    </w:rPr>
+                    <w:t xml:space="preserve"> </w:t>
+                  </w:r>
+                  <w:r>
+                    <w:rPr>
+                      <w:rtl/>
+                    </w:rPr>
+                    <w:t xml:space="preserve">الهندسة في الفضاء</w:t>
+                  </w:r>
+                </w:p>
+              </w:tc>
+            </w:tr>
+            <w:tr>
+              <w:tc>
+                <w:tcPr/>
+                <w:p>
+                  <w:pPr>
+                    <w:pStyle w:val="Compact"/>
+                    <w:bidi/>
+                    <w:jc w:val="left"/>
+                  </w:pPr>
+                  <w:r>
+                    <w:rPr>
+                      <w:b/>
+                      <w:bCs/>
+                      <w:rtl/>
+                    </w:rPr>
+                    <w:t xml:space="preserve">الأستاذ:</w:t>
+                  </w:r>
+                  <w:r>
+                    <w:rPr>
+                      <w:rtl/>
+                    </w:rPr>
+                    <w:t xml:space="preserve"> </w:t>
+                  </w:r>
+                  <w:r>
+                    <w:rPr>
+                      <w:rtl/>
+                    </w:rPr>
+                    <w:t xml:space="preserve">..........</w:t>
+                  </w:r>
+                </w:p>
+              </w:tc>
+              <w:tc>
+                <w:tcPr/>
+                <w:p>
+                  <w:pPr>
+                    <w:pStyle w:val="Compact"/>
+                    <w:bidi/>
+                    <w:jc w:val="left"/>
+                  </w:pPr>
+                  <w:r>
+                    <w:rPr>
+                      <w:b/>
+                      <w:bCs/>
+                      <w:rtl/>
+                    </w:rPr>
+                    <w:t xml:space="preserve">المحتوى المعرفي:</w:t>
+                  </w:r>
+                  <w:r>
+                    <w:rPr>
+                      <w:rtl/>
+                    </w:rPr>
+                    <w:t xml:space="preserve"> </w:t>
+                  </w:r>
+                  <w:r>
+                    <w:rPr>
+                      <w:rtl/>
+                    </w:rPr>
+                    <w:t xml:space="preserve">سطح الكرة ، الأسطوانة الدورانية ، المخروط الدوراني (شعبتا رياضيات وتقني رياضي)</w:t>
+                  </w:r>
+                </w:p>
+              </w:tc>
+            </w:tr>
+          </w:tbl>
+          <w:p>
+            <w:pPr>
+              <w:bidi/>
+              <w:spacing w:before="120"/>
+            </w:pPr>
+          </w:p>
+        </w:tc>
+      </w:tr>
+    </w:tbl>
+    <w:p>
+      <w:pPr>
+        <w:bidi/>
+        <w:spacing w:before="0" w:after="0"/>
+      </w:pPr>
+    </w:p>
+    <w:tbl>
+      <w:tblPr>
+        <w:tblStyle w:val="Table"/>
+        <w:tblW w:w="7128" w:type="dxa"/>
+        <w:jc w:val="center"/>
+        <w:tblBorders>
+          <w:top w:val="single" w:sz="4" w:space="0" w:color="000000"/>
+          <w:left w:val="single" w:sz="4" w:space="0" w:color="000000"/>
+          <w:bottom w:val="single" w:sz="4" w:space="0" w:color="000000"/>
+          <w:right w:val="single" w:sz="4" w:space="0" w:color="000000"/>
+          <w:insideH w:val="single" w:sz="4" w:space="0" w:color="000000"/>
+          <w:insideV w:val="single" w:sz="4" w:space="0" w:color="000000"/>
+        </w:tblBorders>
+        <w:tblLook w:firstRow="0" w:lastRow="0" w:firstColumn="0" w:lastColumn="0" w:noHBand="0" w:noVBand="0" w:val="0000"/>
+      </w:tblPr>
+      <w:tblGrid>
+        <w:gridCol w:w="3564"/>
+        <w:gridCol w:w="3564"/>
+      </w:tblGrid>
+      <w:tr>
+        <w:tc>
+          <w:tcPr/>
+          <w:p>
+            <w:pPr>
+              <w:bidi/>
+              <w:jc w:val="left"/>
+            </w:pPr>
+            <w:r>
+              <w:rPr>
+                <w:b/>
+                <w:bCs/>
+                <w:rtl/>
+              </w:rPr>
+              <w:t xml:space="preserve">الكفاءات المستهدفة:</w:t>
+            </w:r>
+          </w:p>
+          <w:p>
+            <w:pPr>
+              <w:numPr>
+                <w:ilvl w:val="0"/>
+                <w:numId w:val="1014"/>
+              </w:numPr>
+              <w:bidi/>
+              <w:jc w:val="left"/>
+            </w:pPr>
+            <w:r>
+              <w:rPr>
+                <w:rtl/>
+              </w:rPr>
+              <w:t xml:space="preserve">تعيين معادلة سطح كرة وأسطوانة دورانية ومخروط دوراني بدستور المسافة ، ودراسة الوضع النسبي لمستو وسطح كرة.</w:t>
+            </w:r>
+          </w:p>
+        </w:tc>
+        <w:tc>
+          <w:tcPr/>
+          <w:p>
+            <w:pPr>
+              <w:bidi/>
+              <w:jc w:val="left"/>
+            </w:pPr>
+            <w:r>
+              <w:rPr>
+                <w:b/>
+                <w:bCs/>
+                <w:rtl/>
+              </w:rPr>
+              <w:t xml:space="preserve">الكفاءات القبلية:</w:t>
+            </w:r>
+          </w:p>
+          <w:p>
+            <w:pPr>
+              <w:numPr>
+                <w:ilvl w:val="0"/>
+                <w:numId w:val="1015"/>
+              </w:numPr>
+              <w:bidi/>
+              <w:jc w:val="left"/>
+            </w:pPr>
+            <w:r>
+              <w:rPr>
+                <w:rtl/>
+              </w:rPr>
+              <w:t xml:space="preserve">المسافة بين نقطتين ، المسافة بين نقطة ومستو.</w:t>
+            </w:r>
+          </w:p>
+        </w:tc>
+      </w:tr>
+    </w:tbl>
+    <w:p>
+      <w:pPr>
+        <w:bidi/>
+        <w:spacing w:before="120"/>
+      </w:pPr>
+      <w:r>
+        <w:rPr>
+          <w:b/>
+          <w:bCs/>
+          <w:rtl/>
+        </w:rPr>
+        <w:t xml:space="preserve">الوسائل:</w:t>
+      </w:r>
+      <w:r>
+        <w:rPr>
+          <w:rtl/>
+        </w:rPr>
+        <w:t xml:space="preserve"> </w:t>
+      </w:r>
+      <w:r>
+        <w:rPr>
+          <w:rtl/>
+        </w:rPr>
+        <w:t xml:space="preserve">المنهاج ، الكتاب المدرسي (الجزء الثاني) ، مراجع ، مجسمات ، برنامج GeoGebra.</w:t>
+      </w:r>
+    </w:p>
+    <w:tbl>
+      <w:tblPr>
+        <w:tblStyle w:val="Table"/>
+        <w:tblW w:w="7681" w:type="dxa"/>
+        <w:jc w:val="center"/>
+        <w:tblBorders>
+          <w:top w:val="single" w:sz="4" w:space="0" w:color="000000"/>
+          <w:left w:val="single" w:sz="4" w:space="0" w:color="000000"/>
+          <w:bottom w:val="single" w:sz="4" w:space="0" w:color="000000"/>
+          <w:right w:val="single" w:sz="4" w:space="0" w:color="000000"/>
+          <w:insideH w:val="single" w:sz="4" w:space="0" w:color="000000"/>
+          <w:insideV w:val="single" w:sz="4" w:space="0" w:color="000000"/>
+        </w:tblBorders>
+        <w:tblLook w:firstRow="0" w:lastRow="0" w:firstColumn="0" w:lastColumn="0" w:noHBand="0" w:noVBand="0" w:val="0000"/>
+      </w:tblPr>
+      <w:tblGrid>
+        <w:gridCol w:w="1188"/>
+        <w:gridCol w:w="712"/>
+        <w:gridCol w:w="4593"/>
+        <w:gridCol w:w="1188"/>
+      </w:tblGrid>
+      <w:tr>
+        <w:tc>
+          <w:tcPr>
+            <w:shd w:val="clear" w:color="auto" w:fill="E4E7ED"/>
+          </w:tcPr>
+          <w:p>
+            <w:pPr>
+              <w:pStyle w:val="Compact"/>
+              <w:bidi/>
+              <w:jc w:val="left"/>
+            </w:pPr>
+            <w:r>
+              <w:rPr>
+                <w:rtl/>
+              </w:rPr>
+              <w:t xml:space="preserve"/>
+            </w:r>
+            <w:r>
+              <w:rPr>
+                <w:b/>
+                <w:bCs/>
+                <w:rtl/>
+              </w:rPr>
+              <w:t xml:space="preserve">توجيهات وتعاليق</w:t>
+            </w:r>
+          </w:p>
+        </w:tc>
+        <w:tc>
+          <w:tcPr>
+            <w:shd w:val="clear" w:color="auto" w:fill="E4E7ED"/>
+          </w:tcPr>
+          <w:p>
+            <w:pPr>
+              <w:pStyle w:val="Compact"/>
+              <w:bidi/>
+              <w:jc w:val="left"/>
+            </w:pPr>
+            <w:r>
+              <w:rPr>
+                <w:b/>
+                <w:bCs/>
+                <w:rtl/>
+              </w:rPr>
+              <w:t xml:space="preserve">المدة</w:t>
+            </w:r>
+          </w:p>
+        </w:tc>
+        <w:tc>
+          <w:tcPr>
+            <w:shd w:val="clear" w:color="auto" w:fill="E4E7ED"/>
+          </w:tcPr>
+          <w:p>
+            <w:pPr>
+              <w:pStyle w:val="Compact"/>
+              <w:bidi/>
+              <w:jc w:val="left"/>
+            </w:pPr>
+            <w:r>
+              <w:rPr>
+                <w:b/>
+                <w:bCs/>
+                <w:rtl/>
+              </w:rPr>
+              <w:t xml:space="preserve">سير الحصة</w:t>
+            </w:r>
+          </w:p>
+        </w:tc>
+        <w:tc>
+          <w:tcPr>
+            <w:shd w:val="clear" w:color="auto" w:fill="E4E7ED"/>
+          </w:tcPr>
+          <w:p>
+            <w:pPr>
+              <w:pStyle w:val="Compact"/>
+              <w:bidi/>
+              <w:jc w:val="left"/>
+            </w:pPr>
+            <w:r>
+              <w:rPr>
+                <w:b/>
+                <w:bCs/>
+                <w:rtl/>
+              </w:rPr>
+              <w:t xml:space="preserve">مراحل الحصة</w:t>
+            </w:r>
+          </w:p>
+        </w:tc>
+      </w:tr>
+      <w:tr>
+        <w:tc>
+          <w:tcPr/>
+          <w:p>
+            <w:pPr>
+              <w:pStyle w:val="Compact"/>
+              <w:bidi/>
+              <w:jc w:val="left"/>
+            </w:pPr>
+            <w:r>
+              <w:rPr>
+                <w:rtl/>
+              </w:rPr>
+              <w:t xml:space="preserve">سؤالان.</w:t>
+            </w:r>
+          </w:p>
+        </w:tc>
+        <w:tc>
+          <w:tcPr/>
+          <w:p>
+            <w:pPr>
+              <w:pStyle w:val="Compact"/>
+              <w:bidi/>
+              <w:jc w:val="left"/>
+            </w:pPr>
+            <w:r>
+              <w:rPr>
+                <w:rtl/>
+              </w:rPr>
+              <w:t xml:space="preserve">10 د</w:t>
+            </w:r>
+          </w:p>
+        </w:tc>
+        <w:tc>
+          <w:tcPr/>
+          <w:p>
+            <w:pPr>
+              <w:pStyle w:val="Compact"/>
+              <w:bidi/>
+              <w:jc w:val="left"/>
+            </w:pPr>
+            <w:r>
+              <w:rPr>
+                <w:b/>
+                <w:bCs/>
+                <w:rtl/>
+              </w:rPr>
+              <w:t xml:space="preserve">التهيئة النفسية:</w:t>
+            </w:r>
+            <w:r>
+              <w:rPr>
+                <w:rtl/>
+              </w:rPr>
+              <w:t xml:space="preserve"> </w:t>
+            </w:r>
+            <w:r>
+              <w:rPr>
+                <w:rtl/>
+              </w:rPr>
+              <w:t xml:space="preserve">ما مجموعة النقط في الفضاء التي تبعد عن نقطة</w:t>
+            </w:r>
+            <w:r>
+              <w:rPr>
+                <w:rtl/>
+              </w:rPr>
+              <w:t xml:space="preserve"> </w:t>
+            </w:r>
+            <m:oMath>
+              <m:r>
+                <m:t>Ω</m:t>
+              </m:r>
+            </m:oMath>
+            <w:r>
+              <w:rPr>
+                <w:rtl/>
+              </w:rPr>
+              <w:t xml:space="preserve"> </w:t>
+            </w:r>
+            <w:r>
+              <w:rPr>
+                <w:rtl/>
+              </w:rPr>
+              <w:t xml:space="preserve">بمسافة</w:t>
+            </w:r>
+            <w:r>
+              <w:rPr>
+                <w:rtl/>
+              </w:rPr>
+              <w:t xml:space="preserve"> </w:t>
+            </w:r>
+            <m:oMath>
+              <m:r>
+                <m:t>3</m:t>
+              </m:r>
+            </m:oMath>
+            <w:r>
+              <w:rPr>
+                <w:rtl/>
+              </w:rPr>
+              <w:t xml:space="preserve"> </w:t>
+            </w:r>
+            <w:r>
+              <w:rPr>
+                <w:rtl/>
+              </w:rPr>
+              <w:t xml:space="preserve">؟ والتي تبعد عن محور بمسافة</w:t>
+            </w:r>
+            <w:r>
+              <w:rPr>
+                <w:rtl/>
+              </w:rPr>
+              <w:t xml:space="preserve"> </w:t>
+            </w:r>
+            <m:oMath>
+              <m:r>
+                <m:t>3</m:t>
+              </m:r>
+            </m:oMath>
+            <w:r>
+              <w:rPr>
+                <w:rtl/>
+              </w:rPr>
+              <w:t xml:space="preserve"> </w:t>
+            </w:r>
+            <w:r>
+              <w:rPr>
+                <w:rtl/>
+              </w:rPr>
+              <w:t xml:space="preserve">؟</w:t>
+            </w:r>
+          </w:p>
+        </w:tc>
+        <w:tc>
+          <w:tcPr>
+            <w:shd w:val="clear" w:color="auto" w:fill="E4E7ED"/>
+          </w:tcPr>
+          <w:p>
+            <w:pPr>
+              <w:pStyle w:val="Compact"/>
+              <w:bidi/>
+              <w:jc w:val="left"/>
+            </w:pPr>
+            <w:r>
+              <w:rPr>
+                <w:rtl/>
+              </w:rPr>
+              <w:t xml:space="preserve"/>
+            </w:r>
+            <w:r>
+              <w:rPr>
+                <w:b/>
+                <w:bCs/>
+                <w:rtl/>
+              </w:rPr>
+              <w:t xml:space="preserve">مرحلة الانطلاق</w:t>
+            </w:r>
+          </w:p>
+        </w:tc>
+      </w:tr>
+      <w:tr>
+        <w:tc>
+          <w:tcPr/>
+          <w:p>
+            <w:pPr>
+              <w:pStyle w:val="Compact"/>
+              <w:bidi/>
+              <w:jc w:val="left"/>
+            </w:pPr>
+            <w:r>
+              <w:rPr>
+                <w:rtl/>
+              </w:rPr>
+              <w:t xml:space="preserve">دستور المسافة.</w:t>
+            </w:r>
+          </w:p>
+        </w:tc>
+        <w:tc>
+          <w:tcPr/>
+          <w:p>
+            <w:pPr>
+              <w:pStyle w:val="Compact"/>
+              <w:bidi/>
+              <w:jc w:val="left"/>
+            </w:pPr>
+            <w:r>
+              <w:rPr>
+                <w:rtl/>
+              </w:rPr>
+              <w:t xml:space="preserve">35 د</w:t>
+            </w:r>
+          </w:p>
+        </w:tc>
+        <w:tc>
+          <w:tcPr/>
+          <w:p>
+            <w:pPr>
+              <w:bidi/>
+              <w:jc w:val="left"/>
+            </w:pPr>
+            <w:r>
+              <w:rPr>
+                <w:b/>
+                <w:bCs/>
+                <w:rtl/>
+              </w:rPr>
+              <w:t xml:space="preserve">[وضعية مقترحة]</w:t>
+            </w:r>
+          </w:p>
+          <w:p>
+            <w:pPr>
+              <w:bidi/>
+              <w:jc w:val="left"/>
+            </w:pPr>
+            <w:r>
+              <w:rPr>
+                <w:rtl/>
+              </w:rPr>
+              <w:t xml:space="preserve">✓ </w:t>
+            </w:r>
+            <m:oMath>
+              <m:r>
+                <m:t>Ω</m:t>
+              </m:r>
+              <m:r>
+                <m:t>M</m:t>
+              </m:r>
+              <m:r>
+                <m:rPr>
+                  <m:sty m:val="p"/>
+                </m:rPr>
+                <m:t>=</m:t>
+              </m:r>
+              <m:r>
+                <m:t>3</m:t>
+              </m:r>
+            </m:oMath>
+            <w:r>
+              <w:rPr>
+                <w:rtl/>
+              </w:rPr>
+              <w:t xml:space="preserve"> </w:t>
+            </w:r>
+            <w:r>
+              <w:rPr>
+                <w:rtl/>
+              </w:rPr>
+              <w:t xml:space="preserve">يعني</w:t>
+            </w:r>
+            <w:r>
+              <w:rPr>
+                <w:rtl/>
+              </w:rPr>
+              <w:t xml:space="preserve"> </w:t>
+            </w:r>
+            <m:oMath>
+              <m:r>
+                <m:t>Ω</m:t>
+              </m:r>
+              <m:sSup>
+                <m:e>
+                  <m:r>
+                    <m:t>M</m:t>
+                  </m:r>
+                </m:e>
+                <m:sup>
+                  <m:r>
+                    <m:t>2</m:t>
+                  </m:r>
+                </m:sup>
+              </m:sSup>
+              <m:r>
+                <m:rPr>
+                  <m:sty m:val="p"/>
+                </m:rPr>
+                <m:t>=</m:t>
+              </m:r>
+              <m:r>
+                <m:t>9</m:t>
+              </m:r>
+            </m:oMath>
+            <w:r>
+              <w:rPr>
+                <w:rtl/>
+              </w:rPr>
+              <w:t xml:space="preserve">: معادلة من الدرجة الثانية في</w:t>
+            </w:r>
+            <w:r>
+              <w:rPr>
+                <w:rtl/>
+              </w:rPr>
+              <w:t xml:space="preserve"> </w:t>
+            </w:r>
+            <m:oMath>
+              <m:r>
+                <m:t>x</m:t>
+              </m:r>
+            </m:oMath>
+            <w:r>
+              <w:rPr>
+                <w:rtl/>
+              </w:rPr>
+              <w:t xml:space="preserve"> </w:t>
+            </w:r>
+            <w:r>
+              <w:rPr>
+                <w:rtl/>
+              </w:rPr>
+              <w:t xml:space="preserve">،</w:t>
+            </w:r>
+            <w:r>
+              <w:rPr>
+                <w:rtl/>
+              </w:rPr>
+              <w:t xml:space="preserve"> </w:t>
+            </w:r>
+            <m:oMath>
+              <m:r>
+                <m:t>y</m:t>
+              </m:r>
+            </m:oMath>
+            <w:r>
+              <w:rPr>
+                <w:rtl/>
+              </w:rPr>
+              <w:t xml:space="preserve"> </w:t>
+            </w:r>
+            <w:r>
+              <w:rPr>
+                <w:rtl/>
+              </w:rPr>
+              <w:t xml:space="preserve">،</w:t>
+            </w:r>
+            <w:r>
+              <w:rPr>
+                <w:rtl/>
+              </w:rPr>
+              <w:t xml:space="preserve"> </w:t>
+            </w:r>
+            <m:oMath>
+              <m:r>
+                <m:t>z</m:t>
+              </m:r>
+            </m:oMath>
+            <w:r>
+              <w:rPr>
+                <w:rtl/>
+              </w:rPr>
+              <w:t xml:space="preserve">.</w:t>
+            </w:r>
+          </w:p>
+          <w:p>
+            <w:pPr>
+              <w:bidi/>
+              <w:jc w:val="left"/>
+            </w:pPr>
+            <w:r>
+              <w:rPr>
+                <w:rtl/>
+              </w:rPr>
+              <w:t xml:space="preserve">✓ بعد</w:t>
+            </w:r>
+            <w:r>
+              <w:rPr>
+                <w:rtl/>
+              </w:rPr>
+              <w:t xml:space="preserve"> </w:t>
+            </w:r>
+            <m:oMath>
+              <m:r>
+                <m:t>M</m:t>
+              </m:r>
+              <m:d>
+                <m:dPr>
+                  <m:begChr m:val="("/>
+                  <m:endChr m:val=")"/>
+                  <m:sepChr m:val=""/>
+                  <m:grow/>
+                </m:dPr>
+                <m:e>
+                  <m:r>
+                    <m:t>x</m:t>
+                  </m:r>
+                  <m:r>
+                    <m:rPr>
+                      <m:sty m:val="p"/>
+                    </m:rPr>
+                    <m:t>;</m:t>
+                  </m:r>
+                  <m:r>
+                    <m:t>y</m:t>
+                  </m:r>
+                  <m:r>
+                    <m:rPr>
+                      <m:sty m:val="p"/>
+                    </m:rPr>
+                    <m:t>;</m:t>
+                  </m:r>
+                  <m:r>
+                    <m:t>z</m:t>
+                  </m:r>
+                </m:e>
+              </m:d>
+            </m:oMath>
+            <w:r>
+              <w:rPr>
+                <w:rtl/>
+              </w:rPr>
+              <w:t xml:space="preserve"> </w:t>
+            </w:r>
+            <w:r>
+              <w:rPr>
+                <w:rtl/>
+              </w:rPr>
+              <w:t xml:space="preserve">عن المحور</w:t>
+            </w:r>
+            <w:r>
+              <w:rPr>
+                <w:rtl/>
+              </w:rPr>
+              <w:t xml:space="preserve"> </w:t>
+            </w:r>
+            <m:oMath>
+              <m:d>
+                <m:dPr>
+                  <m:begChr m:val="("/>
+                  <m:endChr m:val=")"/>
+                  <m:sepChr m:val=""/>
+                  <m:grow/>
+                </m:dPr>
+                <m:e>
+                  <m:r>
+                    <m:t>O</m:t>
+                  </m:r>
+                  <m:r>
+                    <m:t>z</m:t>
+                  </m:r>
+                </m:e>
+              </m:d>
+            </m:oMath>
+            <w:r>
+              <w:rPr>
+                <w:rtl/>
+              </w:rPr>
+              <w:t xml:space="preserve"> </w:t>
+            </w:r>
+            <w:r>
+              <w:rPr>
+                <w:rtl/>
+              </w:rPr>
+              <w:t xml:space="preserve">هو</w:t>
+            </w:r>
+            <w:r>
+              <w:rPr>
+                <w:rtl/>
+              </w:rPr>
+              <w:t xml:space="preserve"> </w:t>
+            </w:r>
+            <m:oMath>
+              <m:rad>
+                <m:radPr>
+                  <m:degHide m:val="on"/>
+                </m:radPr>
+                <m:deg/>
+                <m:e>
+                  <m:sSup>
+                    <m:e>
+                      <m:r>
+                        <m:t>x</m:t>
+                      </m:r>
+                    </m:e>
+                    <m:sup>
+                      <m:r>
+                        <m:t>2</m:t>
+                      </m:r>
+                    </m:sup>
+                  </m:sSup>
+                  <m:r>
+                    <m:rPr>
+                      <m:sty m:val="p"/>
+                    </m:rPr>
+                    <m:t>+</m:t>
+                  </m:r>
+                  <m:sSup>
+                    <m:e>
+                      <m:r>
+                        <m:t>y</m:t>
+                      </m:r>
+                    </m:e>
+                    <m:sup>
+                      <m:r>
+                        <m:t>2</m:t>
+                      </m:r>
+                    </m:sup>
+                  </m:sSup>
+                </m:e>
+              </m:rad>
+            </m:oMath>
+            <w:r>
+              <w:rPr>
+                <w:rtl/>
+              </w:rPr>
+              <w:t xml:space="preserve">.</w:t>
+            </w:r>
+          </w:p>
+        </w:tc>
+        <w:tc>
+          <w:tcPr>
+            <w:shd w:val="clear" w:color="auto" w:fill="E4E7ED"/>
+          </w:tcPr>
+          <w:p>
+            <w:pPr>
+              <w:pStyle w:val="Compact"/>
+              <w:bidi/>
+              <w:jc w:val="left"/>
+            </w:pPr>
+            <w:r>
+              <w:rPr>
+                <w:rtl/>
+              </w:rPr>
+              <w:t xml:space="preserve"/>
+            </w:r>
+            <w:r>
+              <w:rPr>
+                <w:b/>
+                <w:bCs/>
+                <w:rtl/>
+              </w:rPr>
+              <w:t xml:space="preserve">التشخيص والاكتشاف</w:t>
+            </w:r>
+          </w:p>
+        </w:tc>
+      </w:tr>
+      <w:tr>
+        <w:tc>
+          <w:tcPr/>
+          <w:p>
+            <w:pPr>
+              <w:pStyle w:val="Compact"/>
+              <w:bidi/>
+              <w:jc w:val="left"/>
+            </w:pPr>
+            <w:r>
+              <w:rPr>
+                <w:rtl/>
+              </w:rPr>
+              <w:t xml:space="preserve">مقارنة</w:t>
+            </w:r>
+            <w:r>
+              <w:rPr>
+                <w:rtl/>
+              </w:rPr>
+              <w:t xml:space="preserve"> </w:t>
+            </w:r>
+            <m:oMath>
+              <m:r>
+                <m:t>d</m:t>
+              </m:r>
+            </m:oMath>
+            <w:r>
+              <w:rPr>
+                <w:rtl/>
+              </w:rPr>
+              <w:t xml:space="preserve"> </w:t>
+            </w:r>
+            <w:r>
+              <w:rPr>
+                <w:rtl/>
+              </w:rPr>
+              <w:t xml:space="preserve">بـ</w:t>
+            </w:r>
+            <w:r>
+              <w:rPr>
+                <w:rtl/>
+              </w:rPr>
+              <w:t xml:space="preserve"> </w:t>
+            </w:r>
+            <m:oMath>
+              <m:r>
+                <m:t>r</m:t>
+              </m:r>
+            </m:oMath>
+            <w:r>
+              <w:rPr>
+                <w:rtl/>
+              </w:rPr>
+              <w:t xml:space="preserve">.</w:t>
+            </w:r>
+          </w:p>
+        </w:tc>
+        <w:tc>
+          <w:tcPr/>
+          <w:p>
+            <w:pPr>
+              <w:pStyle w:val="Compact"/>
+              <w:bidi/>
+              <w:jc w:val="left"/>
+            </w:pPr>
+            <w:r>
+              <w:rPr>
+                <w:rtl/>
+              </w:rPr>
+              <w:t xml:space="preserve">50 د</w:t>
+            </w:r>
+          </w:p>
+        </w:tc>
+        <w:tc>
+          <w:tcPr/>
+          <w:p>
+            <w:pPr>
+              <w:bidi/>
+              <w:jc w:val="left"/>
+            </w:pPr>
+            <w:r>
+              <w:rPr>
+                <w:b/>
+                <w:bCs/>
+                <w:rtl/>
+              </w:rPr>
+              <w:t xml:space="preserve">[سطح الكرة]</w:t>
+            </w:r>
+            <w:r>
+              <w:rPr>
+                <w:rtl/>
+              </w:rPr>
+              <w:t xml:space="preserve"> مركزه</w:t>
+            </w:r>
+            <w:r>
+              <w:rPr>
+                <w:rtl/>
+              </w:rPr>
+              <w:t xml:space="preserve"> </w:t>
+            </w:r>
+            <m:oMath>
+              <m:r>
+                <m:t>Ω</m:t>
+              </m:r>
+              <m:d>
+                <m:dPr>
+                  <m:begChr m:val="("/>
+                  <m:endChr m:val=")"/>
+                  <m:sepChr m:val=""/>
+                  <m:grow/>
+                </m:dPr>
+                <m:e>
+                  <m:r>
+                    <m:t>a</m:t>
+                  </m:r>
+                  <m:r>
+                    <m:rPr>
+                      <m:sty m:val="p"/>
+                    </m:rPr>
+                    <m:t>;</m:t>
+                  </m:r>
+                  <m:r>
+                    <m:t>b</m:t>
+                  </m:r>
+                  <m:r>
+                    <m:rPr>
+                      <m:sty m:val="p"/>
+                    </m:rPr>
+                    <m:t>;</m:t>
+                  </m:r>
+                  <m:r>
+                    <m:t>c</m:t>
+                  </m:r>
+                </m:e>
+              </m:d>
+            </m:oMath>
+            <w:r>
+              <w:rPr>
+                <w:rtl/>
+              </w:rPr>
+              <w:t xml:space="preserve"> </w:t>
+            </w:r>
+            <w:r>
+              <w:rPr>
+                <w:rtl/>
+              </w:rPr>
+              <w:t xml:space="preserve">ونصف قطره</w:t>
+            </w:r>
+            <w:r>
+              <w:rPr>
+                <w:rtl/>
+              </w:rPr>
+              <w:t xml:space="preserve"> </w:t>
+            </w:r>
+            <m:oMath>
+              <m:r>
+                <m:t>r</m:t>
+              </m:r>
+            </m:oMath>
+            <w:r>
+              <w:rPr>
+                <w:rtl/>
+              </w:rPr>
+              <w:t xml:space="preserve">:</w:t>
+            </w:r>
+            <w:r>
+              <w:rPr>
+                <w:rtl/>
+              </w:rPr>
+              <w:t xml:space="preserve"> </w:t>
+            </w:r>
+            <m:oMath>
+              <m:sSup>
+                <m:e>
+                  <m:d>
+                    <m:dPr>
+                      <m:begChr m:val="("/>
+                      <m:endChr m:val=")"/>
+                      <m:sepChr m:val=""/>
+                      <m:grow/>
+                    </m:dPr>
+                    <m:e>
+                      <m:r>
+                        <m:t>x</m:t>
+                      </m:r>
+                      <m:r>
+                        <m:rPr>
+                          <m:sty m:val="p"/>
+                        </m:rPr>
+                        <m:t>−</m:t>
+                      </m:r>
+                      <m:r>
+                        <m:t>a</m:t>
+                      </m:r>
+                    </m:e>
+                  </m:d>
+                </m:e>
+                <m:sup>
+                  <m:r>
+                    <m:t>2</m:t>
+                  </m:r>
+                </m:sup>
+              </m:sSup>
+              <m:r>
+                <m:rPr>
+                  <m:sty m:val="p"/>
+                </m:rPr>
+                <m:t>+</m:t>
+              </m:r>
+              <m:sSup>
+                <m:e>
+                  <m:d>
+                    <m:dPr>
+                      <m:begChr m:val="("/>
+                      <m:endChr m:val=")"/>
+                      <m:sepChr m:val=""/>
+                      <m:grow/>
+                    </m:dPr>
+                    <m:e>
+                      <m:r>
+                        <m:t>y</m:t>
+                      </m:r>
+                      <m:r>
+                        <m:rPr>
+                          <m:sty m:val="p"/>
+                        </m:rPr>
+                        <m:t>−</m:t>
+                      </m:r>
+                      <m:r>
+                        <m:t>b</m:t>
+                      </m:r>
+                    </m:e>
+                  </m:d>
+                </m:e>
+                <m:sup>
+                  <m:r>
+                    <m:t>2</m:t>
+                  </m:r>
+                </m:sup>
+              </m:sSup>
+              <m:r>
+                <m:rPr>
+                  <m:sty m:val="p"/>
+                </m:rPr>
+                <m:t>+</m:t>
+              </m:r>
+              <m:sSup>
+                <m:e>
+                  <m:d>
+                    <m:dPr>
+                      <m:begChr m:val="("/>
+                      <m:endChr m:val=")"/>
+                      <m:sepChr m:val=""/>
+                      <m:grow/>
+                    </m:dPr>
+                    <m:e>
+                      <m:r>
+                        <m:t>z</m:t>
+                      </m:r>
+                      <m:r>
+                        <m:rPr>
+                          <m:sty m:val="p"/>
+                        </m:rPr>
+                        <m:t>−</m:t>
+                      </m:r>
+                      <m:r>
+                        <m:t>c</m:t>
+                      </m:r>
+                    </m:e>
+                  </m:d>
+                </m:e>
+                <m:sup>
+                  <m:r>
+                    <m:t>2</m:t>
+                  </m:r>
+                </m:sup>
+              </m:sSup>
+              <m:r>
+                <m:rPr>
+                  <m:sty m:val="p"/>
+                </m:rPr>
+                <m:t>=</m:t>
+              </m:r>
+              <m:sSup>
+                <m:e>
+                  <m:r>
+                    <m:t>r</m:t>
+                  </m:r>
+                </m:e>
+                <m:sup>
+                  <m:r>
+                    <m:t>2</m:t>
+                  </m:r>
+                </m:sup>
+              </m:sSup>
+            </m:oMath>
+            <w:r>
+              <w:rPr>
+                <w:rtl/>
+              </w:rPr>
+              <w:t xml:space="preserve">.</w:t>
+            </w:r>
+          </w:p>
+          <w:p>
+            <w:pPr>
+              <w:bidi/>
+              <w:jc w:val="left"/>
+            </w:pPr>
+            <w:r>
+              <w:rPr>
+                <w:b/>
+                <w:bCs/>
+                <w:rtl/>
+              </w:rPr>
+              <w:t xml:space="preserve">[الأسطوانة والمخروط (محورهما</w:t>
+            </w:r>
+            <w:r>
+              <w:rPr>
+                <w:b/>
+                <w:bCs/>
+                <w:rtl/>
+              </w:rPr>
+              <w:t xml:space="preserve"> </w:t>
+            </w:r>
+            <m:oMath>
+              <m:d>
+                <m:dPr>
+                  <m:begChr m:val="("/>
+                  <m:endChr m:val=")"/>
+                  <m:sepChr m:val=""/>
+                  <m:grow/>
+                </m:dPr>
+                <m:e>
+                  <m:r>
+                    <m:t>O</m:t>
+                  </m:r>
+                  <m:r>
+                    <m:t>z</m:t>
+                  </m:r>
+                </m:e>
+              </m:d>
+            </m:oMath>
+            <w:r>
+              <w:rPr>
+                <w:b/>
+                <w:bCs/>
+                <w:rtl/>
+              </w:rPr>
+              <w:t xml:space="preserve">)]</w:t>
+            </w:r>
+          </w:p>
+          <w:p>
+            <w:pPr>
+              <w:bidi/>
+              <w:jc w:val="left"/>
+            </w:pPr>
+            <w:r>
+              <w:rPr>
+                <w:rtl/>
+              </w:rPr>
+              <w:t xml:space="preserve">✓ أسطوانة دورانية نصف قطرها</w:t>
+            </w:r>
+            <w:r>
+              <w:rPr>
+                <w:rtl/>
+              </w:rPr>
+              <w:t xml:space="preserve"> </w:t>
+            </w:r>
+            <m:oMath>
+              <m:r>
+                <m:t>r</m:t>
+              </m:r>
+            </m:oMath>
+            <w:r>
+              <w:rPr>
+                <w:rtl/>
+              </w:rPr>
+              <w:t xml:space="preserve">:</w:t>
+            </w:r>
+            <w:r>
+              <w:rPr>
+                <w:rtl/>
+              </w:rPr>
+              <w:t xml:space="preserve"> </w:t>
+            </w:r>
+            <m:oMath>
+              <m:sSup>
+                <m:e>
+                  <m:r>
+                    <m:t>x</m:t>
+                  </m:r>
+                </m:e>
+                <m:sup>
+                  <m:r>
+                    <m:t>2</m:t>
+                  </m:r>
+                </m:sup>
+              </m:sSup>
+              <m:r>
+                <m:rPr>
+                  <m:sty m:val="p"/>
+                </m:rPr>
+                <m:t>+</m:t>
+              </m:r>
+              <m:sSup>
+                <m:e>
+                  <m:r>
+                    <m:t>y</m:t>
+                  </m:r>
+                </m:e>
+                <m:sup>
+                  <m:r>
+                    <m:t>2</m:t>
+                  </m:r>
+                </m:sup>
+              </m:sSup>
+              <m:r>
+                <m:rPr>
+                  <m:sty m:val="p"/>
+                </m:rPr>
+                <m:t>=</m:t>
+              </m:r>
+              <m:sSup>
+                <m:e>
+                  <m:r>
+                    <m:t>r</m:t>
+                  </m:r>
+                </m:e>
+                <m:sup>
+                  <m:r>
+                    <m:t>2</m:t>
+                  </m:r>
+                </m:sup>
+              </m:sSup>
+            </m:oMath>
+            <w:r>
+              <w:rPr>
+                <w:rtl/>
+              </w:rPr>
+              <w:t xml:space="preserve">.</w:t>
+            </w:r>
+          </w:p>
+          <w:p>
+            <w:pPr>
+              <w:bidi/>
+              <w:jc w:val="left"/>
+            </w:pPr>
+            <w:r>
+              <w:rPr>
+                <w:rtl/>
+              </w:rPr>
+              <w:t xml:space="preserve">✓ مخروط دوراني رأسه</w:t>
+            </w:r>
+            <w:r>
+              <w:rPr>
+                <w:rtl/>
+              </w:rPr>
+              <w:t xml:space="preserve"> </w:t>
+            </w:r>
+            <m:oMath>
+              <m:r>
+                <m:t>O</m:t>
+              </m:r>
+            </m:oMath>
+            <w:r>
+              <w:rPr>
+                <w:rtl/>
+              </w:rPr>
+              <w:t xml:space="preserve"> </w:t>
+            </w:r>
+            <w:r>
+              <w:rPr>
+                <w:rtl/>
+              </w:rPr>
+              <w:t xml:space="preserve">ونصف زاويته</w:t>
+            </w:r>
+            <w:r>
+              <w:rPr>
+                <w:rtl/>
+              </w:rPr>
+              <w:t xml:space="preserve"> </w:t>
+            </w:r>
+            <m:oMath>
+              <m:r>
+                <m:t>α</m:t>
+              </m:r>
+            </m:oMath>
+            <w:r>
+              <w:rPr>
+                <w:rtl/>
+              </w:rPr>
+              <w:t xml:space="preserve">:</w:t>
+            </w:r>
+            <w:r>
+              <w:rPr>
+                <w:rtl/>
+              </w:rPr>
+              <w:t xml:space="preserve"> </w:t>
+            </w:r>
+            <m:oMath>
+              <m:sSup>
+                <m:e>
+                  <m:r>
+                    <m:t>x</m:t>
+                  </m:r>
+                </m:e>
+                <m:sup>
+                  <m:r>
+                    <m:t>2</m:t>
+                  </m:r>
+                </m:sup>
+              </m:sSup>
+              <m:r>
+                <m:rPr>
+                  <m:sty m:val="p"/>
+                </m:rPr>
+                <m:t>+</m:t>
+              </m:r>
+              <m:sSup>
+                <m:e>
+                  <m:r>
+                    <m:t>y</m:t>
+                  </m:r>
+                </m:e>
+                <m:sup>
+                  <m:r>
+                    <m:t>2</m:t>
+                  </m:r>
+                </m:sup>
+              </m:sSup>
+              <m:r>
+                <m:rPr>
+                  <m:sty m:val="p"/>
+                </m:rPr>
+                <m:t>=</m:t>
+              </m:r>
+              <m:sSup>
+                <m:e>
+                  <m:d>
+                    <m:dPr>
+                      <m:begChr m:val="("/>
+                      <m:endChr m:val=")"/>
+                      <m:sepChr m:val=""/>
+                      <m:grow/>
+                    </m:dPr>
+                    <m:e>
+                      <m:r>
+                        <m:rPr>
+                          <m:sty m:val="p"/>
+                        </m:rPr>
+                        <m:t>tan</m:t>
+                      </m:r>
+                      <m:r>
+                        <m:t>α</m:t>
+                      </m:r>
+                    </m:e>
+                  </m:d>
+                </m:e>
+                <m:sup>
+                  <m:r>
+                    <m:t>2</m:t>
+                  </m:r>
+                </m:sup>
+              </m:sSup>
+              <m:sSup>
+                <m:e>
+                  <m:r>
+                    <m:t>z</m:t>
+                  </m:r>
+                </m:e>
+                <m:sup>
+                  <m:r>
+                    <m:t>2</m:t>
+                  </m:r>
+                </m:sup>
+              </m:sSup>
+            </m:oMath>
+            <w:r>
+              <w:rPr>
+                <w:rtl/>
+              </w:rPr>
+              <w:t xml:space="preserve">.</w:t>
+            </w:r>
+          </w:p>
+        </w:tc>
+        <w:tc>
+          <w:tcPr>
+            <w:shd w:val="clear" w:color="auto" w:fill="E4E7ED"/>
+          </w:tcPr>
+          <w:p>
+            <w:pPr>
+              <w:pStyle w:val="Compact"/>
+              <w:bidi/>
+              <w:jc w:val="left"/>
+            </w:pPr>
+            <w:r>
+              <w:rPr>
+                <w:rtl/>
+              </w:rPr>
+              <w:t xml:space="preserve"/>
+            </w:r>
+            <w:r>
+              <w:rPr>
+                <w:b/>
+                <w:bCs/>
+                <w:rtl/>
+              </w:rPr>
+              <w:t xml:space="preserve">بناء المعارف</w:t>
+            </w:r>
+          </w:p>
+        </w:tc>
+      </w:tr>
+      <w:tr>
+        <w:tc>
+          <w:tcPr/>
+          <w:p>
+            <w:pPr>
+              <w:pStyle w:val="Compact"/>
+              <w:bidi/>
+              <w:jc w:val="center"/>
+            </w:pPr>
+          </w:p>
+        </w:tc>
+        <w:tc>
+          <w:tcPr/>
+          <w:p>
+            <w:pPr>
+              <w:pStyle w:val="Compact"/>
+              <w:bidi/>
+              <w:jc w:val="center"/>
+            </w:pPr>
+          </w:p>
+        </w:tc>
+        <w:tc>
+          <w:tcPr/>
+          <w:p>
+            <w:pPr>
+              <w:bidi/>
+              <w:jc w:val="left"/>
+            </w:pPr>
+            <w:r>
+              <w:rPr>
+                <w:b/>
+                <w:bCs/>
+                <w:rtl/>
+              </w:rPr>
+              <w:t xml:space="preserve">[مثال]</w:t>
+            </w:r>
+          </w:p>
+          <w:p>
+            <w:pPr>
+              <w:bidi/>
+              <w:jc w:val="left"/>
+            </w:pPr>
+            <w:r>
+              <w:rPr>
+                <w:rtl/>
+              </w:rPr>
+              <w:t xml:space="preserve">✓ </w:t>
+            </w:r>
+            <m:oMath>
+              <m:sSup>
+                <m:e>
+                  <m:r>
+                    <m:t>x</m:t>
+                  </m:r>
+                </m:e>
+                <m:sup>
+                  <m:r>
+                    <m:t>2</m:t>
+                  </m:r>
+                </m:sup>
+              </m:sSup>
+              <m:r>
+                <m:rPr>
+                  <m:sty m:val="p"/>
+                </m:rPr>
+                <m:t>+</m:t>
+              </m:r>
+              <m:sSup>
+                <m:e>
+                  <m:r>
+                    <m:t>y</m:t>
+                  </m:r>
+                </m:e>
+                <m:sup>
+                  <m:r>
+                    <m:t>2</m:t>
+                  </m:r>
+                </m:sup>
+              </m:sSup>
+              <m:r>
+                <m:rPr>
+                  <m:sty m:val="p"/>
+                </m:rPr>
+                <m:t>+</m:t>
+              </m:r>
+              <m:sSup>
+                <m:e>
+                  <m:r>
+                    <m:t>z</m:t>
+                  </m:r>
+                </m:e>
+                <m:sup>
+                  <m:r>
+                    <m:t>2</m:t>
+                  </m:r>
+                </m:sup>
+              </m:sSup>
+              <m:r>
+                <m:rPr>
+                  <m:sty m:val="p"/>
+                </m:rPr>
+                <m:t>−</m:t>
+              </m:r>
+              <m:r>
+                <m:t>2</m:t>
+              </m:r>
+              <m:r>
+                <m:t>x</m:t>
+              </m:r>
+              <m:r>
+                <m:rPr>
+                  <m:sty m:val="p"/>
+                </m:rPr>
+                <m:t>+</m:t>
+              </m:r>
+              <m:r>
+                <m:t>4</m:t>
+              </m:r>
+              <m:r>
+                <m:t>y</m:t>
+              </m:r>
+              <m:r>
+                <m:rPr>
+                  <m:sty m:val="p"/>
+                </m:rPr>
+                <m:t>−</m:t>
+              </m:r>
+              <m:r>
+                <m:t>4</m:t>
+              </m:r>
+              <m:r>
+                <m:rPr>
+                  <m:sty m:val="p"/>
+                </m:rPr>
+                <m:t>=</m:t>
+              </m:r>
+              <m:r>
+                <m:t>0</m:t>
+              </m:r>
+            </m:oMath>
+            <w:r>
+              <w:rPr>
+                <w:rtl/>
+              </w:rPr>
+              <w:t xml:space="preserve"> </w:t>
+            </w:r>
+            <w:r>
+              <w:rPr>
+                <w:rtl/>
+              </w:rPr>
+              <w:t xml:space="preserve">يكافئ</w:t>
+            </w:r>
+            <w:r>
+              <w:rPr>
+                <w:rtl/>
+              </w:rPr>
+              <w:t xml:space="preserve"> </w:t>
+            </w:r>
+            <m:oMath>
+              <m:sSup>
+                <m:e>
+                  <m:d>
+                    <m:dPr>
+                      <m:begChr m:val="("/>
+                      <m:endChr m:val=")"/>
+                      <m:sepChr m:val=""/>
+                      <m:grow/>
+                    </m:dPr>
+                    <m:e>
+                      <m:r>
+                        <m:t>x</m:t>
+                      </m:r>
+                      <m:r>
+                        <m:rPr>
+                          <m:sty m:val="p"/>
+                        </m:rPr>
+                        <m:t>−</m:t>
+                      </m:r>
+                      <m:r>
+                        <m:t>1</m:t>
+                      </m:r>
+                    </m:e>
+                  </m:d>
+                </m:e>
+                <m:sup>
+                  <m:r>
+                    <m:t>2</m:t>
+                  </m:r>
+                </m:sup>
+              </m:sSup>
+              <m:r>
+                <m:rPr>
+                  <m:sty m:val="p"/>
+                </m:rPr>
+                <m:t>+</m:t>
+              </m:r>
+              <m:sSup>
+                <m:e>
+                  <m:d>
+                    <m:dPr>
+                      <m:begChr m:val="("/>
+                      <m:endChr m:val=")"/>
+                      <m:sepChr m:val=""/>
+                      <m:grow/>
+                    </m:dPr>
+                    <m:e>
+                      <m:r>
+                        <m:t>y</m:t>
+                      </m:r>
+                      <m:r>
+                        <m:rPr>
+                          <m:sty m:val="p"/>
+                        </m:rPr>
+                        <m:t>+</m:t>
+                      </m:r>
+                      <m:r>
+                        <m:t>2</m:t>
+                      </m:r>
+                    </m:e>
+                  </m:d>
+                </m:e>
+                <m:sup>
+                  <m:r>
+                    <m:t>2</m:t>
+                  </m:r>
+                </m:sup>
+              </m:sSup>
+              <m:r>
+                <m:rPr>
+                  <m:sty m:val="p"/>
+                </m:rPr>
+                <m:t>+</m:t>
+              </m:r>
+              <m:sSup>
+                <m:e>
+                  <m:r>
+                    <m:t>z</m:t>
+                  </m:r>
+                </m:e>
+                <m:sup>
+                  <m:r>
+                    <m:t>2</m:t>
+                  </m:r>
+                </m:sup>
+              </m:sSup>
+              <m:r>
+                <m:rPr>
+                  <m:sty m:val="p"/>
+                </m:rPr>
+                <m:t>=</m:t>
+              </m:r>
+              <m:r>
+                <m:t>9</m:t>
+              </m:r>
+            </m:oMath>
+            <w:r>
+              <w:rPr>
+                <w:rtl/>
+              </w:rPr>
+              <w:t xml:space="preserve">: سطح كرة مركزه</w:t>
+            </w:r>
+            <w:r>
+              <w:rPr>
+                <w:rtl/>
+              </w:rPr>
+              <w:t xml:space="preserve"> </w:t>
+            </w:r>
+            <m:oMath>
+              <m:r>
+                <m:t>Ω</m:t>
+              </m:r>
+              <m:d>
+                <m:dPr>
+                  <m:begChr m:val="("/>
+                  <m:endChr m:val=")"/>
+                  <m:sepChr m:val=""/>
+                  <m:grow/>
+                </m:dPr>
+                <m:e>
+                  <m:r>
+                    <m:t>1</m:t>
+                  </m:r>
+                  <m:r>
+                    <m:rPr>
+                      <m:sty m:val="p"/>
+                    </m:rPr>
+                    <m:t>;</m:t>
+                  </m:r>
+                  <m:r>
+                    <m:rPr>
+                      <m:sty m:val="p"/>
+                    </m:rPr>
+                    <m:t>−</m:t>
+                  </m:r>
+                  <m:r>
+                    <m:t>2</m:t>
+                  </m:r>
+                  <m:r>
+                    <m:rPr>
+                      <m:sty m:val="p"/>
+                    </m:rPr>
+                    <m:t>;</m:t>
+                  </m:r>
+                  <m:r>
+                    <m:t>0</m:t>
+                  </m:r>
+                </m:e>
+              </m:d>
+            </m:oMath>
+            <w:r>
+              <w:rPr>
+                <w:rtl/>
+              </w:rPr>
+              <w:t xml:space="preserve"> </w:t>
+            </w:r>
+            <w:r>
+              <w:rPr>
+                <w:rtl/>
+              </w:rPr>
+              <w:t xml:space="preserve">ونصف قطره</w:t>
+            </w:r>
+            <w:r>
+              <w:rPr>
+                <w:rtl/>
+              </w:rPr>
+              <w:t xml:space="preserve"> </w:t>
+            </w:r>
+            <m:oMath>
+              <m:r>
+                <m:t>3</m:t>
+              </m:r>
+            </m:oMath>
+            <w:r>
+              <w:rPr>
+                <w:rtl/>
+              </w:rPr>
+              <w:t xml:space="preserve">.</w:t>
+            </w:r>
+          </w:p>
+          <w:p>
+            <w:pPr>
+              <w:bidi/>
+              <w:jc w:val="left"/>
+            </w:pPr>
+            <w:r>
+              <w:rPr>
+                <w:rtl/>
+              </w:rPr>
+              <w:t xml:space="preserve">✓ </w:t>
+            </w:r>
+            <m:oMath>
+              <m:r>
+                <m:t>d</m:t>
+              </m:r>
+              <m:d>
+                <m:dPr>
+                  <m:begChr m:val="("/>
+                  <m:endChr m:val=")"/>
+                  <m:sepChr m:val=""/>
+                  <m:grow/>
+                </m:dPr>
+                <m:e>
+                  <m:r>
+                    <m:t>Ω</m:t>
+                  </m:r>
+                  <m:r>
+                    <m:rPr>
+                      <m:sty m:val="p"/>
+                    </m:rPr>
+                    <m:t>;</m:t>
+                  </m:r>
+                  <m:d>
+                    <m:dPr>
+                      <m:begChr m:val="("/>
+                      <m:endChr m:val=")"/>
+                      <m:sepChr m:val=""/>
+                      <m:grow/>
+                    </m:dPr>
+                    <m:e>
+                      <m:r>
+                        <m:t>P</m:t>
+                      </m:r>
+                    </m:e>
+                  </m:d>
+                </m:e>
+              </m:d>
+            </m:oMath>
+            <w:r>
+              <w:rPr>
+                <w:rtl/>
+              </w:rPr>
+              <w:t xml:space="preserve"> </w:t>
+            </w:r>
+            <w:r>
+              <w:rPr>
+                <w:rtl/>
+              </w:rPr>
+              <w:t xml:space="preserve">مع</w:t>
+            </w:r>
+            <w:r>
+              <w:rPr>
+                <w:rtl/>
+              </w:rPr>
+              <w:t xml:space="preserve"> </w:t>
+            </w:r>
+            <m:oMath>
+              <m:d>
+                <m:dPr>
+                  <m:begChr m:val="("/>
+                  <m:endChr m:val=")"/>
+                  <m:sepChr m:val=""/>
+                  <m:grow/>
+                </m:dPr>
+                <m:e>
+                  <m:r>
+                    <m:t>P</m:t>
+                  </m:r>
+                </m:e>
+              </m:d>
+              <m:r>
+                <m:rPr>
+                  <m:sty m:val="p"/>
+                </m:rPr>
+                <m:t>:</m:t>
+              </m:r>
+              <m:r>
+                <m:t>2</m:t>
+              </m:r>
+              <m:r>
+                <m:t>x</m:t>
+              </m:r>
+              <m:r>
+                <m:rPr>
+                  <m:sty m:val="p"/>
+                </m:rPr>
+                <m:t>−</m:t>
+              </m:r>
+              <m:r>
+                <m:t>y</m:t>
+              </m:r>
+              <m:r>
+                <m:rPr>
+                  <m:sty m:val="p"/>
+                </m:rPr>
+                <m:t>+</m:t>
+              </m:r>
+              <m:r>
+                <m:t>2</m:t>
+              </m:r>
+              <m:r>
+                <m:t>z</m:t>
+              </m:r>
+              <m:r>
+                <m:rPr>
+                  <m:sty m:val="p"/>
+                </m:rPr>
+                <m:t>+</m:t>
+              </m:r>
+              <m:r>
+                <m:t>5</m:t>
+              </m:r>
+              <m:r>
+                <m:rPr>
+                  <m:sty m:val="p"/>
+                </m:rPr>
+                <m:t>=</m:t>
+              </m:r>
+              <m:r>
+                <m:t>0</m:t>
+              </m:r>
+            </m:oMath>
+            <w:r>
+              <w:rPr>
+                <w:rtl/>
+              </w:rPr>
+              <w:t xml:space="preserve">:</w:t>
+            </w:r>
+            <w:r>
+              <w:rPr>
+                <w:rtl/>
+              </w:rPr>
+              <w:t xml:space="preserve"> </w:t>
+            </w:r>
+            <m:oMath>
+              <m:f>
+                <m:fPr>
+                  <m:type m:val="bar"/>
+                </m:fPr>
+                <m:num>
+                  <m:d>
+                    <m:dPr>
+                      <m:begChr m:val="|"/>
+                      <m:endChr m:val="|"/>
+                      <m:sepChr m:val=""/>
+                      <m:grow/>
+                    </m:dPr>
+                    <m:e>
+                      <m:r>
+                        <m:t>2</m:t>
+                      </m:r>
+                      <m:r>
+                        <m:rPr>
+                          <m:sty m:val="p"/>
+                        </m:rPr>
+                        <m:t>+</m:t>
+                      </m:r>
+                      <m:r>
+                        <m:t>2</m:t>
+                      </m:r>
+                      <m:r>
+                        <m:rPr>
+                          <m:sty m:val="p"/>
+                        </m:rPr>
+                        <m:t>+</m:t>
+                      </m:r>
+                      <m:r>
+                        <m:t>0</m:t>
+                      </m:r>
+                      <m:r>
+                        <m:rPr>
+                          <m:sty m:val="p"/>
+                        </m:rPr>
+                        <m:t>+</m:t>
+                      </m:r>
+                      <m:r>
+                        <m:t>5</m:t>
+                      </m:r>
+                    </m:e>
+                  </m:d>
+                </m:num>
+                <m:den>
+                  <m:r>
+                    <m:t>3</m:t>
+                  </m:r>
+                </m:den>
+              </m:f>
+              <m:r>
+                <m:rPr>
+                  <m:sty m:val="p"/>
+                </m:rPr>
+                <m:t>=</m:t>
+              </m:r>
+              <m:r>
+                <m:t>3</m:t>
+              </m:r>
+              <m:r>
+                <m:rPr>
+                  <m:sty m:val="p"/>
+                </m:rPr>
+                <m:t>=</m:t>
+              </m:r>
+              <m:r>
+                <m:t>r</m:t>
+              </m:r>
+            </m:oMath>
+            <w:r>
+              <w:rPr>
+                <w:rtl/>
+              </w:rPr>
+              <w:t xml:space="preserve">: المستوي مماس لسطح الكرة.</w:t>
+            </w:r>
+          </w:p>
+          <w:p>
+            <w:pPr>
+              <w:bidi/>
+              <w:jc w:val="left"/>
+            </w:pPr>
+            <w:r>
+              <w:rPr>
+                <w:rtl/>
+              </w:rPr>
+              <w:t xml:space="preserve">✓ </w:t>
+            </w:r>
+            <m:oMath>
+              <m:sSup>
+                <m:e>
+                  <m:r>
+                    <m:t>x</m:t>
+                  </m:r>
+                </m:e>
+                <m:sup>
+                  <m:r>
+                    <m:t>2</m:t>
+                  </m:r>
+                </m:sup>
+              </m:sSup>
+              <m:r>
+                <m:rPr>
+                  <m:sty m:val="p"/>
+                </m:rPr>
+                <m:t>+</m:t>
+              </m:r>
+              <m:sSup>
+                <m:e>
+                  <m:r>
+                    <m:t>y</m:t>
+                  </m:r>
+                </m:e>
+                <m:sup>
+                  <m:r>
+                    <m:t>2</m:t>
+                  </m:r>
+                </m:sup>
+              </m:sSup>
+              <m:r>
+                <m:rPr>
+                  <m:sty m:val="p"/>
+                </m:rPr>
+                <m:t>=</m:t>
+              </m:r>
+              <m:r>
+                <m:t>3</m:t>
+              </m:r>
+              <m:sSup>
+                <m:e>
+                  <m:r>
+                    <m:t>z</m:t>
+                  </m:r>
+                </m:e>
+                <m:sup>
+                  <m:r>
+                    <m:t>2</m:t>
+                  </m:r>
+                </m:sup>
+              </m:sSup>
+            </m:oMath>
+            <w:r>
+              <w:rPr>
+                <w:rtl/>
+              </w:rPr>
+              <w:t xml:space="preserve">: مخروط دوراني ،</w:t>
+            </w:r>
+            <w:r>
+              <w:rPr>
+                <w:rtl/>
+              </w:rPr>
+              <w:t xml:space="preserve"> </w:t>
+            </w:r>
+            <m:oMath>
+              <m:r>
+                <m:rPr>
+                  <m:sty m:val="p"/>
+                </m:rPr>
+                <m:t>tan</m:t>
+              </m:r>
+              <m:r>
+                <m:t>α</m:t>
+              </m:r>
+              <m:r>
+                <m:rPr>
+                  <m:sty m:val="p"/>
+                </m:rPr>
+                <m:t>=</m:t>
+              </m:r>
+              <m:rad>
+                <m:radPr>
+                  <m:degHide m:val="on"/>
+                </m:radPr>
+                <m:deg/>
+                <m:e>
+                  <m:r>
+                    <m:t>3</m:t>
+                  </m:r>
+                </m:e>
+              </m:rad>
+            </m:oMath>
+            <w:r>
+              <w:rPr>
+                <w:rtl/>
+              </w:rPr>
+              <w:t xml:space="preserve"> </w:t>
+            </w:r>
+            <w:r>
+              <w:rPr>
+                <w:rtl/>
+              </w:rPr>
+              <w:t xml:space="preserve">،</w:t>
+            </w:r>
+            <w:r>
+              <w:rPr>
+                <w:rtl/>
+              </w:rPr>
+              <w:t xml:space="preserve"> </w:t>
+            </w:r>
+            <m:oMath>
+              <m:r>
+                <m:t>α</m:t>
+              </m:r>
+              <m:r>
+                <m:rPr>
+                  <m:sty m:val="p"/>
+                </m:rPr>
+                <m:t>=</m:t>
+              </m:r>
+              <m:f>
+                <m:fPr>
+                  <m:type m:val="bar"/>
+                </m:fPr>
+                <m:num>
+                  <m:r>
+                    <m:t>π</m:t>
+                  </m:r>
+                </m:num>
+                <m:den>
+                  <m:r>
+                    <m:t>3</m:t>
+                  </m:r>
+                </m:den>
+              </m:f>
+            </m:oMath>
+            <w:r>
+              <w:rPr>
+                <w:rtl/>
+              </w:rPr>
+              <w:t xml:space="preserve">.</w:t>
+            </w:r>
+          </w:p>
+          <w:p>
+            <w:pPr>
+              <w:bidi/>
+              <w:jc w:val="left"/>
+            </w:pPr>
+            <w:r>
+              <w:rPr>
+                <w:b/>
+                <w:bCs/>
+                <w:rtl/>
+              </w:rPr>
+              <w:t xml:space="preserve">[الوضع النسبي لمستو وسطح كرة]</w:t>
+            </w:r>
+            <w:r>
+              <w:rPr>
+                <w:rtl/>
+              </w:rPr>
+              <w:t xml:space="preserve"> نقارن</w:t>
+            </w:r>
+            <w:r>
+              <w:rPr>
+                <w:rtl/>
+              </w:rPr>
+              <w:t xml:space="preserve"> </w:t>
+            </w:r>
+            <m:oMath>
+              <m:r>
+                <m:t>d</m:t>
+              </m:r>
+              <m:r>
+                <m:rPr>
+                  <m:sty m:val="p"/>
+                </m:rPr>
+                <m:t>=</m:t>
+              </m:r>
+              <m:r>
+                <m:t>d</m:t>
+              </m:r>
+              <m:d>
+                <m:dPr>
+                  <m:begChr m:val="("/>
+                  <m:endChr m:val=")"/>
+                  <m:sepChr m:val=""/>
+                  <m:grow/>
+                </m:dPr>
+                <m:e>
+                  <m:r>
+                    <m:t>Ω</m:t>
+                  </m:r>
+                  <m:r>
+                    <m:rPr>
+                      <m:sty m:val="p"/>
+                    </m:rPr>
+                    <m:t>;</m:t>
+                  </m:r>
+                  <m:d>
+                    <m:dPr>
+                      <m:begChr m:val="("/>
+                      <m:endChr m:val=")"/>
+                      <m:sepChr m:val=""/>
+                      <m:grow/>
+                    </m:dPr>
+                    <m:e>
+                      <m:r>
+                        <m:t>P</m:t>
+                      </m:r>
+                    </m:e>
+                  </m:d>
+                </m:e>
+              </m:d>
+            </m:oMath>
+            <w:r>
+              <w:rPr>
+                <w:rtl/>
+              </w:rPr>
+              <w:t xml:space="preserve"> </w:t>
+            </w:r>
+            <w:r>
+              <w:rPr>
+                <w:rtl/>
+              </w:rPr>
+              <w:t xml:space="preserve">بـ</w:t>
+            </w:r>
+            <w:r>
+              <w:rPr>
+                <w:rtl/>
+              </w:rPr>
+              <w:t xml:space="preserve"> </w:t>
+            </w:r>
+            <m:oMath>
+              <m:r>
+                <m:t>r</m:t>
+              </m:r>
+            </m:oMath>
+            <w:r>
+              <w:rPr>
+                <w:rtl/>
+              </w:rPr>
+              <w:t xml:space="preserve">:</w:t>
+            </w:r>
+            <w:r>
+              <w:rPr>
+                <w:rtl/>
+              </w:rPr>
+              <w:t xml:space="preserve"> </w:t>
+            </w:r>
+            <m:oMath>
+              <m:r>
+                <m:t>d</m:t>
+              </m:r>
+              <m:r>
+                <m:rPr>
+                  <m:sty m:val="p"/>
+                </m:rPr>
+                <m:t>&lt;</m:t>
+              </m:r>
+              <m:r>
+                <m:t>r</m:t>
+              </m:r>
+            </m:oMath>
+            <w:r>
+              <w:rPr>
+                <w:rtl/>
+              </w:rPr>
+              <w:t xml:space="preserve"> </w:t>
+            </w:r>
+            <w:r>
+              <w:rPr>
+                <w:rtl/>
+              </w:rPr>
+              <w:t xml:space="preserve">تقاطع وفق دائرة ،</w:t>
+            </w:r>
+            <w:r>
+              <w:rPr>
+                <w:rtl/>
+              </w:rPr>
+              <w:t xml:space="preserve"> </w:t>
+            </w:r>
+            <m:oMath>
+              <m:r>
+                <m:t>d</m:t>
+              </m:r>
+              <m:r>
+                <m:rPr>
+                  <m:sty m:val="p"/>
+                </m:rPr>
+                <m:t>=</m:t>
+              </m:r>
+              <m:r>
+                <m:t>r</m:t>
+              </m:r>
+            </m:oMath>
+            <w:r>
+              <w:rPr>
+                <w:rtl/>
+              </w:rPr>
+              <w:t xml:space="preserve"> </w:t>
+            </w:r>
+            <w:r>
+              <w:rPr>
+                <w:rtl/>
+              </w:rPr>
+              <w:t xml:space="preserve">تماس ،</w:t>
+            </w:r>
+            <w:r>
+              <w:rPr>
+                <w:rtl/>
+              </w:rPr>
+              <w:t xml:space="preserve"> </w:t>
+            </w:r>
+            <m:oMath>
+              <m:r>
+                <m:t>d</m:t>
+              </m:r>
+              <m:r>
+                <m:rPr>
+                  <m:sty m:val="p"/>
+                </m:rPr>
+                <m:t>&gt;</m:t>
+              </m:r>
+              <m:r>
+                <m:t>r</m:t>
+              </m:r>
+            </m:oMath>
+            <w:r>
+              <w:rPr>
+                <w:rtl/>
+              </w:rPr>
+              <w:t xml:space="preserve"> </w:t>
+            </w:r>
+            <w:r>
+              <w:rPr>
+                <w:rtl/>
+              </w:rPr>
+              <w:t xml:space="preserve">لا تقاطع.</w:t>
+            </w:r>
+          </w:p>
+        </w:tc>
+        <w:tc>
+          <w:tcPr>
+            <w:shd w:val="clear" w:color="auto" w:fill="E4E7ED"/>
+          </w:tcPr>
+          <w:p>
+            <w:pPr>
+              <w:pStyle w:val="Compact"/>
+              <w:bidi/>
+              <w:jc w:val="left"/>
+            </w:pPr>
+            <w:r>
+              <w:rPr>
+                <w:rtl/>
+              </w:rPr>
+              <w:t xml:space="preserve"/>
+            </w:r>
+          </w:p>
+        </w:tc>
+      </w:tr>
+      <w:tr>
+        <w:tc>
+          <w:tcPr/>
+          <w:p>
+            <w:pPr>
+              <w:pStyle w:val="Compact"/>
+              <w:bidi/>
+              <w:jc w:val="center"/>
+            </w:pPr>
+          </w:p>
+        </w:tc>
+        <w:tc>
+          <w:tcPr/>
+          <w:p>
+            <w:pPr>
+              <w:pStyle w:val="Compact"/>
+              <w:bidi/>
+              <w:jc w:val="center"/>
+            </w:pPr>
+          </w:p>
+        </w:tc>
+        <w:tc>
+          <w:tcPr/>
+          <w:p>
+            <w:pPr>
+              <w:pStyle w:val="Compact"/>
+              <w:bidi/>
+              <w:jc w:val="left"/>
+            </w:pPr>
+            <w:r>
+              <w:rPr>
+                <w:b/>
+                <w:bCs/>
+                <w:rtl/>
+              </w:rPr>
+              <w:t xml:space="preserve">[حذار]</w:t>
+            </w:r>
+            <w:r>
+              <w:rPr>
+                <w:rtl/>
+              </w:rPr>
+              <w:t xml:space="preserve"> شعبة العلوم التجريبية لا تدرس هذه المعادلات.</w:t>
+            </w:r>
+          </w:p>
+        </w:tc>
+        <w:tc>
+          <w:tcPr>
+            <w:shd w:val="clear" w:color="auto" w:fill="E4E7ED"/>
+          </w:tcPr>
+          <w:p>
+            <w:pPr>
+              <w:pStyle w:val="Compact"/>
+              <w:bidi/>
+              <w:jc w:val="left"/>
+            </w:pPr>
+            <w:r>
+              <w:rPr>
+                <w:rtl/>
+              </w:rPr>
+              <w:t xml:space="preserve"/>
+            </w:r>
+          </w:p>
+        </w:tc>
+      </w:tr>
+      <w:tr>
+        <w:tc>
+          <w:tcPr/>
+          <w:p>
+            <w:pPr>
+              <w:pStyle w:val="Compact"/>
+              <w:bidi/>
+              <w:jc w:val="left"/>
+            </w:pPr>
+            <w:r>
+              <w:rPr>
+                <w:rtl/>
+              </w:rPr>
+              <w:t xml:space="preserve">تقويم فردي.</w:t>
+            </w:r>
+          </w:p>
+        </w:tc>
+        <w:tc>
+          <w:tcPr/>
+          <w:p>
+            <w:pPr>
+              <w:pStyle w:val="Compact"/>
+              <w:bidi/>
+              <w:jc w:val="left"/>
+            </w:pPr>
+            <w:r>
+              <w:rPr>
+                <w:rtl/>
+              </w:rPr>
+              <w:t xml:space="preserve">25 د</w:t>
+            </w:r>
+          </w:p>
+        </w:tc>
+        <w:tc>
+          <w:tcPr/>
+          <w:p>
+            <w:pPr>
+              <w:bidi/>
+              <w:jc w:val="left"/>
+            </w:pPr>
+            <w:r>
+              <w:rPr>
+                <w:b/>
+                <w:bCs/>
+                <w:rtl/>
+              </w:rPr>
+              <w:t xml:space="preserve">[تطبيق]</w:t>
+            </w:r>
+          </w:p>
+          <w:p>
+            <w:pPr>
+              <w:bidi/>
+              <w:jc w:val="left"/>
+            </w:pPr>
+            <w:r>
+              <w:rPr>
+                <w:rtl/>
+              </w:rPr>
+              <w:t xml:space="preserve">اكتب معادلة سطح الكرة الذي مركزه</w:t>
+            </w:r>
+            <w:r>
+              <w:rPr>
+                <w:rtl/>
+              </w:rPr>
+              <w:t xml:space="preserve"> </w:t>
+            </w:r>
+            <m:oMath>
+              <m:r>
+                <m:t>A</m:t>
+              </m:r>
+              <m:d>
+                <m:dPr>
+                  <m:begChr m:val="("/>
+                  <m:endChr m:val=")"/>
+                  <m:sepChr m:val=""/>
+                  <m:grow/>
+                </m:dPr>
+                <m:e>
+                  <m:r>
+                    <m:t>1</m:t>
+                  </m:r>
+                  <m:r>
+                    <m:rPr>
+                      <m:sty m:val="p"/>
+                    </m:rPr>
+                    <m:t>;</m:t>
+                  </m:r>
+                  <m:r>
+                    <m:t>0</m:t>
+                  </m:r>
+                  <m:r>
+                    <m:rPr>
+                      <m:sty m:val="p"/>
+                    </m:rPr>
+                    <m:t>;</m:t>
+                  </m:r>
+                  <m:r>
+                    <m:t>1</m:t>
+                  </m:r>
+                </m:e>
+              </m:d>
+            </m:oMath>
+            <w:r>
+              <w:rPr>
+                <w:rtl/>
+              </w:rPr>
+              <w:t xml:space="preserve"> </w:t>
+            </w:r>
+            <w:r>
+              <w:rPr>
+                <w:rtl/>
+              </w:rPr>
+              <w:t xml:space="preserve">ويشمل</w:t>
+            </w:r>
+            <w:r>
+              <w:rPr>
+                <w:rtl/>
+              </w:rPr>
+              <w:t xml:space="preserve"> </w:t>
+            </w:r>
+            <m:oMath>
+              <m:r>
+                <m:t>O</m:t>
+              </m:r>
+            </m:oMath>
+            <w:r>
+              <w:rPr>
+                <w:rtl/>
+              </w:rPr>
+              <w:t xml:space="preserve"> </w:t>
+            </w:r>
+            <w:r>
+              <w:rPr>
+                <w:rtl/>
+              </w:rPr>
+              <w:t xml:space="preserve">، ثم عيّن تقاطعه مع المستوي</w:t>
+            </w:r>
+            <w:r>
+              <w:rPr>
+                <w:rtl/>
+              </w:rPr>
+              <w:t xml:space="preserve"> </w:t>
+            </w:r>
+            <m:oMath>
+              <m:r>
+                <m:t>z</m:t>
+              </m:r>
+              <m:r>
+                <m:rPr>
+                  <m:sty m:val="p"/>
+                </m:rPr>
+                <m:t>=</m:t>
+              </m:r>
+              <m:r>
+                <m:t>1</m:t>
+              </m:r>
+            </m:oMath>
+            <w:r>
+              <w:rPr>
+                <w:rtl/>
+              </w:rPr>
+              <w:t xml:space="preserve">.</w:t>
+            </w:r>
+          </w:p>
+          <w:p>
+            <w:pPr>
+              <w:bidi/>
+              <w:jc w:val="left"/>
+            </w:pPr>
+            <w:r>
+              <w:rPr>
+                <w:b/>
+                <w:bCs/>
+                <w:rtl/>
+              </w:rPr>
+              <w:t xml:space="preserve">الحل:</w:t>
+            </w:r>
+            <w:r>
+              <w:rPr>
+                <w:rtl/>
+              </w:rPr>
+              <w:t xml:space="preserve"> </w:t>
+            </w:r>
+            <m:oMath>
+              <m:sSup>
+                <m:e>
+                  <m:r>
+                    <m:t>r</m:t>
+                  </m:r>
+                </m:e>
+                <m:sup>
+                  <m:r>
+                    <m:t>2</m:t>
+                  </m:r>
+                </m:sup>
+              </m:sSup>
+              <m:r>
+                <m:rPr>
+                  <m:sty m:val="p"/>
+                </m:rPr>
+                <m:t>=</m:t>
+              </m:r>
+              <m:r>
+                <m:t>A</m:t>
+              </m:r>
+              <m:sSup>
+                <m:e>
+                  <m:r>
+                    <m:t>O</m:t>
+                  </m:r>
+                </m:e>
+                <m:sup>
+                  <m:r>
+                    <m:t>2</m:t>
+                  </m:r>
+                </m:sup>
+              </m:sSup>
+              <m:r>
+                <m:rPr>
+                  <m:sty m:val="p"/>
+                </m:rPr>
+                <m:t>=</m:t>
+              </m:r>
+              <m:r>
+                <m:t>2</m:t>
+              </m:r>
+            </m:oMath>
+            <w:r>
+              <w:rPr>
+                <w:rtl/>
+              </w:rPr>
+              <w:t xml:space="preserve">:</w:t>
+            </w:r>
+            <w:r>
+              <w:rPr>
+                <w:rtl/>
+              </w:rPr>
+              <w:t xml:space="preserve"> </w:t>
+            </w:r>
+            <m:oMath>
+              <m:sSup>
+                <m:e>
+                  <m:d>
+                    <m:dPr>
+                      <m:begChr m:val="("/>
+                      <m:endChr m:val=")"/>
+                      <m:sepChr m:val=""/>
+                      <m:grow/>
+                    </m:dPr>
+                    <m:e>
+                      <m:r>
+                        <m:t>x</m:t>
+                      </m:r>
+                      <m:r>
+                        <m:rPr>
+                          <m:sty m:val="p"/>
+                        </m:rPr>
+                        <m:t>−</m:t>
+                      </m:r>
+                      <m:r>
+                        <m:t>1</m:t>
+                      </m:r>
+                    </m:e>
+                  </m:d>
+                </m:e>
+                <m:sup>
+                  <m:r>
+                    <m:t>2</m:t>
+                  </m:r>
+                </m:sup>
+              </m:sSup>
+              <m:r>
+                <m:rPr>
+                  <m:sty m:val="p"/>
+                </m:rPr>
+                <m:t>+</m:t>
+              </m:r>
+              <m:sSup>
+                <m:e>
+                  <m:r>
+                    <m:t>y</m:t>
+                  </m:r>
+                </m:e>
+                <m:sup>
+                  <m:r>
+                    <m:t>2</m:t>
+                  </m:r>
+                </m:sup>
+              </m:sSup>
+              <m:r>
+                <m:rPr>
+                  <m:sty m:val="p"/>
+                </m:rPr>
+                <m:t>+</m:t>
+              </m:r>
+              <m:sSup>
+                <m:e>
+                  <m:d>
+                    <m:dPr>
+                      <m:begChr m:val="("/>
+                      <m:endChr m:val=")"/>
+                      <m:sepChr m:val=""/>
+                      <m:grow/>
+                    </m:dPr>
+                    <m:e>
+                      <m:r>
+                        <m:t>z</m:t>
+                      </m:r>
+                      <m:r>
+                        <m:rPr>
+                          <m:sty m:val="p"/>
+                        </m:rPr>
+                        <m:t>−</m:t>
+                      </m:r>
+                      <m:r>
+                        <m:t>1</m:t>
+                      </m:r>
+                    </m:e>
+                  </m:d>
+                </m:e>
+                <m:sup>
+                  <m:r>
+                    <m:t>2</m:t>
+                  </m:r>
+                </m:sup>
+              </m:sSup>
+              <m:r>
+                <m:rPr>
+                  <m:sty m:val="p"/>
+                </m:rPr>
+                <m:t>=</m:t>
+              </m:r>
+              <m:r>
+                <m:t>2</m:t>
+              </m:r>
+            </m:oMath>
+            <w:r>
+              <w:rPr>
+                <w:rtl/>
+              </w:rPr>
+              <w:t xml:space="preserve"> </w:t>
+            </w:r>
+            <w:r>
+              <w:rPr>
+                <w:rtl/>
+              </w:rPr>
+              <w:t xml:space="preserve">؛ المستوي يشمل</w:t>
+            </w:r>
+            <w:r>
+              <w:rPr>
+                <w:rtl/>
+              </w:rPr>
+              <w:t xml:space="preserve"> </w:t>
+            </w:r>
+            <m:oMath>
+              <m:r>
+                <m:t>A</m:t>
+              </m:r>
+            </m:oMath>
+            <w:r>
+              <w:rPr>
+                <w:rtl/>
+              </w:rPr>
+              <w:t xml:space="preserve">: دائرة مركزها</w:t>
+            </w:r>
+            <w:r>
+              <w:rPr>
+                <w:rtl/>
+              </w:rPr>
+              <w:t xml:space="preserve"> </w:t>
+            </w:r>
+            <m:oMath>
+              <m:r>
+                <m:t>A</m:t>
+              </m:r>
+            </m:oMath>
+            <w:r>
+              <w:rPr>
+                <w:rtl/>
+              </w:rPr>
+              <w:t xml:space="preserve"> </w:t>
+            </w:r>
+            <w:r>
+              <w:rPr>
+                <w:rtl/>
+              </w:rPr>
+              <w:t xml:space="preserve">ونصف قطرها</w:t>
+            </w:r>
+            <w:r>
+              <w:rPr>
+                <w:rtl/>
+              </w:rPr>
+              <w:t xml:space="preserve"> </w:t>
+            </w:r>
+            <m:oMath>
+              <m:rad>
+                <m:radPr>
+                  <m:degHide m:val="on"/>
+                </m:radPr>
+                <m:deg/>
+                <m:e>
+                  <m:r>
+                    <m:t>2</m:t>
+                  </m:r>
+                </m:e>
+              </m:rad>
+            </m:oMath>
+            <w:r>
+              <w:rPr>
+                <w:rtl/>
+              </w:rPr>
+              <w:t xml:space="preserve">.</w:t>
+            </w:r>
+          </w:p>
+          <w:p>
+            <w:pPr>
+              <w:bidi/>
+              <w:jc w:val="left"/>
+            </w:pPr>
+            <w:r>
+              <w:rPr>
+                <w:b/>
+                <w:bCs/>
+                <w:rtl/>
+              </w:rPr>
+              <w:t xml:space="preserve">واجب منزلي:</w:t>
+            </w:r>
+            <w:r>
+              <w:rPr>
+                <w:rtl/>
+              </w:rPr>
+              <w:t xml:space="preserve"> </w:t>
+            </w:r>
+            <w:r>
+              <w:rPr>
+                <w:rtl/>
+              </w:rPr>
+              <w:t xml:space="preserve">تمارين من باب الهندسة في الفضاء (الكرة ، الأسطوانة ، المخروط).</w:t>
+            </w:r>
+          </w:p>
+          <w:p>
+            <w:pPr>
+              <w:bidi/>
+              <w:jc w:val="left"/>
+            </w:pPr>
+            <w:r>
+              <w:rPr>
+                <w:b/>
+                <w:bCs/>
+                <w:rtl/>
+              </w:rPr>
+              <w:t xml:space="preserve">ملاحظات حول سير الحصة:</w:t>
+            </w:r>
+            <w:r>
+              <w:rPr>
+                <w:rtl/>
+              </w:rPr>
+              <w:t xml:space="preserve"> </w:t>
+            </w:r>
+            <w:r>
+              <w:rPr>
+                <w:rtl/>
+              </w:rPr>
+              <w:t xml:space="preserve">..........</w:t>
+            </w:r>
+          </w:p>
+        </w:tc>
+        <w:tc>
+          <w:tcPr>
+            <w:shd w:val="clear" w:color="auto" w:fill="E4E7ED"/>
+          </w:tcPr>
+          <w:p>
+            <w:pPr>
+              <w:pStyle w:val="Compact"/>
+              <w:bidi/>
+              <w:jc w:val="left"/>
+            </w:pPr>
+            <w:r>
+              <w:rPr>
+                <w:rtl/>
+              </w:rPr>
+              <w:t xml:space="preserve"/>
+            </w:r>
+            <w:r>
+              <w:rPr>
+                <w:b/>
+                <w:bCs/>
+                <w:rtl/>
+              </w:rPr>
+              <w:t xml:space="preserve">التقويم</w:t>
+            </w:r>
+          </w:p>
+        </w:tc>
+      </w:tr>
+    </w:tbl>
+    <w:p>
+      <w:pPr>
+        <w:bidi/>
+        <w:spacing w:before="120"/>
+      </w:pPr>
+      <w:r>
+        <w:rPr>
+          <w:rtl/>
+        </w:rPr>
+        <w:br w:type="page"/>
+      </w:r>
+    </w:p>
+    <w:tbl>
+      <w:tblPr>
+        <w:tblW w:w="9864" w:type="dxa"/>
+        <w:jc w:val="center"/>
+        <w:tblBorders>
+          <w:top w:val="single" w:sz="10" w:space="0" w:color="8F1E18"/>
+          <w:left w:val="single" w:sz="10" w:space="0" w:color="8F1E18"/>
+          <w:bottom w:val="single" w:sz="10" w:space="0" w:color="8F1E18"/>
+          <w:right w:val="single" w:sz="10" w:space="0" w:color="8F1E18"/>
+          <w:insideH w:val="single" w:sz="10" w:space="0" w:color="8F1E18"/>
+        </w:tblBorders>
+        <w:tblLayout w:type="fixed"/>
+        <w:tblCellMar>
+          <w:top w:w="40" w:type="dxa"/>
+          <w:left w:w="140" w:type="dxa"/>
+          <w:bottom w:w="60" w:type="dxa"/>
+          <w:right w:w="140" w:type="dxa"/>
+        </w:tblCellMar>
+      </w:tblPr>
+      <w:tblGrid>
+        <w:gridCol w:w="9864"/>
+      </w:tblGrid>
+      <w:tr>
+        <w:trPr>
+          <w:cantSplit/>
+        </w:trPr>
+        <w:tc>
+          <w:tcPr>
+            <w:tcW w:w="9864" w:type="dxa"/>
+            <w:shd w:val="clear" w:color="auto" w:fill="8F1E18"/>
+          </w:tcPr>
+          <w:p>
+            <w:pPr>
+              <w:keepNext/>
+              <w:bidi/>
+              <w:spacing w:before="0" w:after="0"/>
+            </w:pPr>
+            <w:r>
+              <w:rPr>
+                <w:b/>
+                <w:bCs/>
+                <w:color w:val="FFFFFF"/>
+                <w:rtl/>
+              </w:rPr>
+              <w:t xml:space="preserve">مذكرة رقم 86</w:t>
+            </w:r>
+          </w:p>
+        </w:tc>
+      </w:tr>
+      <w:tr>
+        <w:tc>
+          <w:tcPr>
+            <w:tcW w:w="9864" w:type="dxa"/>
+            <w:shd w:val="clear" w:color="auto" w:fill="FBF4F4"/>
+          </w:tcPr>
+          <w:tbl>
+            <w:tblPr>
+              <w:tblStyle w:val="Table"/>
+              <w:tblW w:w="7128" w:type="dxa"/>
+              <w:jc w:val="center"/>
+              <w:tblBorders>
+                <w:top w:val="single" w:sz="4" w:space="0" w:color="000000"/>
+                <w:left w:val="single" w:sz="4" w:space="0" w:color="000000"/>
+                <w:bottom w:val="single" w:sz="4" w:space="0" w:color="000000"/>
+                <w:right w:val="single" w:sz="4" w:space="0" w:color="000000"/>
+                <w:insideH w:val="single" w:sz="4" w:space="0" w:color="000000"/>
+                <w:insideV w:val="single" w:sz="4" w:space="0" w:color="000000"/>
+              </w:tblBorders>
+              <w:tblLook w:firstRow="0" w:lastRow="0" w:firstColumn="0" w:lastColumn="0" w:noHBand="0" w:noVBand="0" w:val="0000"/>
+            </w:tblPr>
+            <w:tblGrid>
+              <w:gridCol w:w="3564"/>
+              <w:gridCol w:w="3564"/>
+            </w:tblGrid>
+            <w:tr>
+              <w:tc>
+                <w:tcPr/>
+                <w:p>
+                  <w:pPr>
+                    <w:pStyle w:val="Compact"/>
+                    <w:bidi/>
+                    <w:jc w:val="left"/>
+                  </w:pPr>
+                  <w:r>
+                    <w:rPr>
+                      <w:b/>
+                      <w:bCs/>
+                      <w:rtl/>
+                    </w:rPr>
+                    <w:t xml:space="preserve">المستوى:</w:t>
+                  </w:r>
+                  <w:r>
+                    <w:rPr>
+                      <w:rtl/>
+                    </w:rPr>
+                    <w:t xml:space="preserve"> </w:t>
+                  </w:r>
+                  <w:r>
+                    <w:rPr>
+                      <w:rtl/>
+                    </w:rPr>
                     <w:t xml:space="preserve">3 ع ت</w:t>
                   </w:r>
                 </w:p>
@@ -13925,7 +17170,7 @@
             <w:pPr>
               <w:numPr>
                 <w:ilvl w:val="0"/>
-                <w:numId w:val="1014"/>
+                <w:numId w:val="1016"/>
               </w:numPr>
               <w:bidi/>
               <w:jc w:val="left"/>
@@ -13958,7 +17203,7 @@
             <w:pPr>
               <w:numPr>
                 <w:ilvl w:val="0"/>
-                <w:numId w:val="1015"/>
+                <w:numId w:val="1017"/>
               </w:numPr>
               <w:bidi/>
               <w:jc w:val="left"/>
@@ -15596,7 +18841,7 @@
                 <w:color w:val="FFFFFF"/>
                 <w:rtl/>
               </w:rPr>
-              <w:t xml:space="preserve">مذكرة رقم 86</w:t>
+              <w:t xml:space="preserve">مذكرة رقم 87</w:t>
             </w:r>
           </w:p>
         </w:tc>
@@ -15930,7 +19175,7 @@
             <w:pPr>
               <w:numPr>
                 <w:ilvl w:val="0"/>
-                <w:numId w:val="1016"/>
+                <w:numId w:val="1018"/>
               </w:numPr>
               <w:bidi/>
               <w:jc w:val="left"/>
@@ -15963,7 +19208,7 @@
             <w:pPr>
               <w:numPr>
                 <w:ilvl w:val="0"/>
-                <w:numId w:val="1017"/>
+                <w:numId w:val="1019"/>
               </w:numPr>
               <w:bidi/>
               <w:jc w:val="left"/>
@@ -17294,7 +20539,7 @@
                 <w:color w:val="FFFFFF"/>
                 <w:rtl/>
               </w:rPr>
-              <w:t xml:space="preserve">مذكرة رقم 87</w:t>
+              <w:t xml:space="preserve">مذكرة رقم 88</w:t>
             </w:r>
           </w:p>
         </w:tc>
@@ -17628,7 +20873,7 @@
             <w:pPr>
               <w:numPr>
                 <w:ilvl w:val="0"/>
-                <w:numId w:val="1018"/>
+                <w:numId w:val="1020"/>
               </w:numPr>
               <w:bidi/>
               <w:jc w:val="left"/>
@@ -17661,7 +20906,7 @@
             <w:pPr>
               <w:numPr>
                 <w:ilvl w:val="0"/>
-                <w:numId w:val="1019"/>
+                <w:numId w:val="1021"/>
               </w:numPr>
               <w:bidi/>
               <w:jc w:val="left"/>
@@ -18164,7 +21409,7 @@
                     <a:graphicData uri="http://schemas.openxmlformats.org/drawingml/2006/picture">
                       <pic:pic>
                         <pic:nvPicPr>
-                          <pic:cNvPr id="0" name="a1e45a09c6eb6f43.png"/>
+                          <pic:cNvPr id="0" name="7affe07fd818c53a.png"/>
                           <pic:cNvPicPr/>
                         </pic:nvPicPr>
                         <pic:blipFill>
@@ -19504,7 +22749,7 @@
         <w:szCs w:val="20"/>
         <w:rtl/>
       </w:rPr>
-      <w:t>السنة الثالثة ثانوي – علوم تجريبية</w:t>
+      <w:t>السنة الثالثة ثانوي – الشعب العلمية</w:t>
     </w:r>
   </w:p>
 </w:hdr>
@@ -19834,6 +23079,12 @@
     <w:abstractNumId w:val="991"/>
   </w:num>
   <w:num w:numId="1019">
+    <w:abstractNumId w:val="991"/>
+  </w:num>
+  <w:num w:numId="1020">
+    <w:abstractNumId w:val="991"/>
+  </w:num>
+  <w:num w:numId="1021">
     <w:abstractNumId w:val="991"/>
   </w:num>
 </w:numbering>

</xml_diff>